<commit_message>
refactor(reporte): depuracion estilistica sin muletillas, fundamentacion integral de modelos estocasticos y sincronizacion total 1:1
</commit_message>
<xml_diff>
--- a/01_Reporte_PDF/Informe_Valuacion_Aluar_word.docx
+++ b/01_Reporte_PDF/Informe_Valuacion_Aluar_word.docx
@@ -26,7 +26,7 @@
           <w:color w:val="4A4A4A"/>
           <w:sz w:val="24"/>
         </w:rPr>
-        <w:t>Reporte de Valuación Fundamental &amp; Cuantitativa Institucional  |  ALUA.BA</w:t>
+        <w:t>Informe de Valuación Fundamental y Análisis de Riesgo  |  ALUA.BA</w:t>
       </w:r>
     </w:p>
     <w:p>
@@ -79,14 +79,14 @@
                 <w:color w:val="0F172A"/>
                 <w:sz w:val="18"/>
               </w:rPr>
-              <w:t>El dictamen técnico del modelo cuantitativo para Aluar Aluminio Argentino S.A.I.C. (ALUA.BA) concluye una recomendación de COMPRAR con un precio objetivo fundamental a 12 meses de ARS 1.236,00 (Target Integrado ARS 1.255,60 incorporando la opción real eólica PEAL V), lo que representa un retorno esperado de +25,8% / +27,8% frente a la cotización spot de ARS 982,50.</w:t>
+              <w:t>El modelo de valuación aplicado a Aluar Aluminio Argentino S.A.I.C. (ALUA.BA) arroja una recomendación técnica de COMPRAR con un precio objetivo fundamental a 12 meses de ARS 1.236,00 por acción (Target Integrado ARS 1.255,60 al incorporar la opción real de expansión eólica PEAL V), frente a una cotización de mercado de ARS 982,50 (+25,8% / +27,8% de retorno esperado).</w:t>
               <w:br/>
               <w:br/>
-              <w:t>1. Liderazgo Estructural en Costos: Matriz 96% autogenerada (78% renovable), blindando su costo en efectivo C1 en USD 1.680/t (primer cuartil global).</w:t>
+              <w:t>1. Estructura de Costos de Primer Cuartil: Matriz 96% autogenerada (78% renovable vía Futaleufú y PEAL), con costo en efectivo C1 en USD 1.680/t (percentil 29% global).</w:t>
               <w:br/>
-              <w:t>2. Flujo Dolarizado y Cobertura Natural: 80% de ingresos en USD vía LME frente a costos fijos domésticos en pesos.</w:t>
+              <w:t>2. Generación Dolarizada con Costos Fijos en Pesos: 80% de ventas en moneda dura vía LME frente a costos fijos operativos locales.</w:t>
               <w:br/>
-              <w:t>3. Compresión Soberana y Desapalancamiento: EMBI+ a 441 pb reduce el WACC a 7,06% (λ=0,20), y el cese del CAPEX eólico recomprime la deuda neta a &lt;1,0x EBITDA hacia FY2028E.</w:t>
+              <w:t>3. Compresión Soberana y Desapalancamiento: EMBI+ a 441 pb sitúa el WACC en 7,06% (λ=0,20), y la moderación del CAPEX reduce la deuda neta a &lt;1,0x EBITDA hacia FY2028E.</w:t>
             </w:r>
           </w:p>
         </w:tc>
@@ -112,7 +112,7 @@
                 <w:color w:val="4A4A4A"/>
                 <w:sz w:val="17"/>
               </w:rPr>
-              <w:t>Dictamen del Modelo Cuantitativo</w:t>
+              <w:t>Dictamen del Modelo Fundamental</w:t>
               <w:br/>
             </w:r>
             <w:r>
@@ -139,23 +139,23 @@
               <w:br/>
               <w:t>Cotización Spot: ARS 982,50</w:t>
               <w:br/>
-              <w:t>Upside Integrado: +27,8%</w:t>
+              <w:t>Retorno Integrado: +27,8%</w:t>
               <w:br/>
               <w:t>─────────────────────────</w:t>
               <w:br/>
-              <w:t>WACC Modelo: 7,06%</w:t>
+              <w:t>WACC del Modelo: 7,06%</w:t>
               <w:br/>
-              <w:t>Costo Equity (Ke): 9,30%</w:t>
+              <w:t>Costo del Equity (Ke): 9,30%</w:t>
               <w:br/>
-              <w:t>Beta Apalancado: 0,888</w:t>
+              <w:t>Beta Apalancado (Hamada): 0,888</w:t>
               <w:br/>
-              <w:t>ERP Damodaran: 4,18%</w:t>
+              <w:t>Prima de Mercado (ERP): 4,18%</w:t>
               <w:br/>
-              <w:t>CRP (λ × EMBI+): 0,88%</w:t>
+              <w:t>Prima País Ponderada (λ × EMBI+): 0,88%</w:t>
               <w:br/>
-              <w:t>Kd (pre / post-tax): 3,80% / 2,47%</w:t>
+              <w:t>Costo Deuda Post-Tax (Kd): 2,47%</w:t>
               <w:br/>
-              <w:t>D/E Objetivo: 0,486</w:t>
+              <w:t>Estructura D/E Objetivo: 0,486</w:t>
               <w:br/>
               <w:t>Crecimiento Terminal (g): 2,00%</w:t>
               <w:br/>
@@ -218,7 +218,7 @@
                 <w:color w:val="0F172A"/>
                 <w:sz w:val="18"/>
               </w:rPr>
-              <w:t>Documento de investigación cuantitativa y análisis financiero con fines exclusivamente educativos y de divulgación académica. No constituye una recomendación de compra, venta o asesoramiento de inversión en los términos de la Ley N.° 26.831. Las opiniones técnicas representan estimaciones independientes fundamentadas en modelos estocásticos y estados financieros públicos auditados.</w:t>
+              <w:t>Documento de investigación académica y análisis financiero independiente con fines exclusivamente formativos y de divulgación. No constituye oferta de compra, venta o asesoramiento de inversión en los términos de la Ley N.° 26.831. Las valuaciones y conclusiones representan estimaciones del autor fundamentadas en estados financieros públicos auditados y modelos financieros estocásticos.</w:t>
               <w:br/>
             </w:r>
           </w:p>
@@ -438,7 +438,7 @@
                 <w:color w:val="0D233A"/>
                 <w:sz w:val="17"/>
               </w:rPr>
-              <w:t>4. Gobernanza Corporativa, Marco Regulatorio y Posicionamiento ESG</w:t>
+              <w:t>4. Gobernanza Corporativa, Marco Regulatorio y Factores ESG</w:t>
             </w:r>
           </w:p>
         </w:tc>
@@ -542,7 +542,7 @@
                 <w:color w:val="0D233A"/>
                 <w:sz w:val="17"/>
               </w:rPr>
-              <w:t>6. Costo de Capital (WACC) y Fundamentación Económica del Factor λ</w:t>
+              <w:t>6. Costo Promedio Ponderado del Capital (WACC) y Factor λ</w:t>
             </w:r>
           </w:p>
         </w:tc>
@@ -594,7 +594,7 @@
                 <w:color w:val="0D233A"/>
                 <w:sz w:val="17"/>
               </w:rPr>
-              <w:t>7. Análisis de Creación de Valor (EVA) y Disciplina de Convergencia Terminal</w:t>
+              <w:t>7. Creación de Valor Económico (EVA) y Disciplina Terminal</w:t>
             </w:r>
           </w:p>
         </w:tc>
@@ -698,7 +698,7 @@
                 <w:color w:val="0D233A"/>
                 <w:sz w:val="17"/>
               </w:rPr>
-              <w:t>9. Análisis Estratégico DuPont y Frameworks Industriales (Porter / PESTEL)</w:t>
+              <w:t>9. Análisis Estratégico DuPont y Fuerzas Competitivas (Porter / PESTEL)</w:t>
             </w:r>
           </w:p>
         </w:tc>
@@ -1010,7 +1010,7 @@
                 <w:color w:val="0D233A"/>
                 <w:sz w:val="17"/>
               </w:rPr>
-              <w:t>15. Gestión Cuantitativa de Riesgo y Asignación de Portafolio</w:t>
+              <w:t>15. Gestión de Riesgos de Mercado y Asignación Óptima de Cartera</w:t>
             </w:r>
           </w:p>
         </w:tc>
@@ -1062,7 +1062,7 @@
                 <w:color w:val="0D233A"/>
                 <w:sz w:val="17"/>
               </w:rPr>
-              <w:t>16. Modelización Estocástica, Dependencia de Cola y Validación Econométrica</w:t>
+              <w:t>16. Modelización Estocástica Avanzada y Validación Econométrica</w:t>
             </w:r>
           </w:p>
         </w:tc>
@@ -1114,7 +1114,7 @@
                 <w:color w:val="0D233A"/>
                 <w:sz w:val="17"/>
               </w:rPr>
-              <w:t>17. Dictamen Final y Recomendación de Inversión</w:t>
+              <w:t>17. Dictamen Final y Conclusión del Modelo</w:t>
             </w:r>
           </w:p>
         </w:tc>
@@ -1218,7 +1218,7 @@
                 <w:color w:val="1E3A8A"/>
                 <w:sz w:val="17"/>
               </w:rPr>
-              <w:t>Referencias Bibliográficas y Fuentes Académicas</w:t>
+              <w:t>Referencias Bibliográficas y Fuentes de Información</w:t>
             </w:r>
           </w:p>
         </w:tc>
@@ -1270,7 +1270,7 @@
                 <w:color w:val="1E3A8A"/>
                 <w:sz w:val="17"/>
               </w:rPr>
-              <w:t>Aviso Legal y Certificación del Analista (Research Standards / Ley 26.831)</w:t>
+              <w:t>Aviso Legal y Certificación del Analista (Ley 26.831)</w:t>
             </w:r>
           </w:p>
         </w:tc>
@@ -1336,7 +1336,7 @@
           <w:color w:val="1E3A8A"/>
           <w:sz w:val="22"/>
         </w:rPr>
-        <w:t>1.1 Perfil Operativo: Integración Vertical y Capacidad al 100%</w:t>
+        <w:t>1.1 Perfil Operativo: Capacidad Instalada e Integración Productiva</w:t>
       </w:r>
     </w:p>
     <w:p>
@@ -1349,7 +1349,7 @@
           <w:color w:val="0F172A"/>
           <w:sz w:val="19"/>
         </w:rPr>
-        <w:t>Aluar Aluminio Argentino S.A.I.C. es el único productor primario de aluminio integrado en Argentina y uno de los mayores complejos industriales de Sudamérica. Fundada en 1974, la compañía opera su planta de reducción electrolítica en Puerto Madryn (Provincia del Chubut) con una capacidad instalada nominal de 460.000 toneladas anuales. Su portafolio abarca aluminio primario líquido y sólido (lingotes estándar, lingotes T, barrotes de extrusión, alambrón y placas de laminación), junto con una división de semielaborados y elaborados de alto valor agregado. Alrededor del 80% del volumen físico producido se exporta a mercados internacionales (Estados Unidos, Brasil, Europa y Japón), liquidado en dólares estadounidenses sobre cotizaciones del London Metal Exchange (LME) más primas regionales, lo que dota a la firma de un flujo operativo estructuralmente dolarizado.</w:t>
+        <w:t>Aluar Aluminio Argentino S.A.I.C. es el único productor primario de aluminio integrado en Argentina y uno de los mayores complejos industriales de Sudamérica. Fundada en 1974, la compañía opera su planta de reducción electrolítica en Puerto Madryn (Provincia del Chubut) con una capacidad instalada nominal de 460.000 toneladas anuales. Su portafolio abarca aluminio primario líquido y sólido (lingotes estándar, lingotes T, barrotes de extrusión, alambrón y placas de laminación), junto con una división de semielaborados y elaborados de mayor valor agregado. Alrededor del 80% del volumen físico producido se destina a la exportación (Estados Unidos, Brasil, Europa y Japón), liquidado en dólares estadounidenses sobre cotizaciones del London Metal Exchange (LME) más primas regionales, lo que dota a la firma de un flujo operativo vinculado a moneda dura.</w:t>
       </w:r>
     </w:p>
     <w:tbl>
@@ -1489,7 +1489,7 @@
                 <w:color w:val="4A4A4A"/>
                 <w:sz w:val="16"/>
               </w:rPr>
-              <w:t>Figura 1: Hitos Históricos de Aluar (1974–2026): Trayectoria de expansión de capacidad instalada y transición energética.</w:t>
+              <w:t>Figura 1: Evolución Histórica de Aluar (1974–2026): Hitos de expansión de capacidad instalada y transición energética.</w:t>
             </w:r>
           </w:p>
         </w:tc>
@@ -1514,7 +1514,7 @@
                 <w:color w:val="4A4A4A"/>
                 <w:sz w:val="16"/>
               </w:rPr>
-              <w:t>Figura 2: Estructura Accionaria: Concentración del 45,98% en el grupo de control (Familia Madanes) y 54,02% capital flotante/ANSES.</w:t>
+              <w:t>Figura 2: Estructura Accionaria: Concentración del 45,98% en el grupo de control (Familia Madanes) y 54,02% flotante/ANSES.</w:t>
             </w:r>
           </w:p>
         </w:tc>
@@ -1550,7 +1550,7 @@
           <w:color w:val="0F172A"/>
           <w:sz w:val="19"/>
         </w:rPr>
-        <w:t>Según la Memoria Anual y Estados Financieros al 30-jun-2025, el capital social está integrado por 2.800 millones de acciones ordinarias escriturales de $1 valor nominal y un voto por acción, listadas en BYMA bajo la especie ALUA.BA. Las sociedades vinculadas a la familia Madanes (CIPAL S.A., Estancias San Javier de Catamarca S.A. y Angerona Group Trust) concentran en conjunto el 45,98% de los derechos de voto, conformando una mayoría de control efectiva frente al 54,02% atomizado entre la ANSES-FGS (27,47%) y el capital flotante en el mercado doméstico e internacional.</w:t>
+        <w:t>Según la Memoria Anual y Estados Financieros al 30-jun-2025, el capital social está integrado por 2.800 millones de acciones ordinarias escriturales de $1 valor nominal y un voto por acción, listadas en BYMA bajo la especie ALUA.BA. Las sociedades vinculadas a la familia Madanes (CIPAL S.A., Estancias San Javier de Catamarca S.A. y Angerona Group Trust) concentran en conjunto el 45,98% de los derechos de voto, conformando el grupo de control frente al 54,02% distribuido entre la ANSES-FGS (27,47%) y el capital flotante en el mercado doméstico e internacional.</w:t>
       </w:r>
     </w:p>
     <w:p>
@@ -1578,7 +1578,7 @@
           <w:color w:val="0F172A"/>
           <w:sz w:val="19"/>
         </w:rPr>
-        <w:t>La fundición de aluminio primario es un proceso electrointensivo donde la energía representa entre el 30% y 40% del costo total de producción. Tres pilares fundamentan el foso defensivo de Aluar:</w:t>
+        <w:t>La fundición de aluminio primario es un proceso electrointensivo donde la energía representa entre el 30% y 40% del costo total de producción. Tres factores sustentan el foso defensivo de la compañía:</w:t>
       </w:r>
     </w:p>
     <w:p>
@@ -1591,7 +1591,7 @@
           <w:color w:val="0F172A"/>
           <w:sz w:val="19"/>
         </w:rPr>
-        <w:t>1. Autonomía Energética Propia (96% del Consumo): La planta de Puerto Madryn es abastecida en un 54% por la Central Hidroeléctrica Futaleufú (320 MW asignados contractualmente bajo concesión), 24% por el Parque Eólico Aluar (PEAL, 200 MW en operación) y 18% por ciclos combinados térmicos propios a gas natural. Sólo el 4% restante se toma de la red nacional (SADI/CAMMESA), blindando a la compañía ante aumentos en las tarifas eléctricas spot.</w:t>
+        <w:t>1. Autonomía Energética Propia (96% del Consumo): La planta de Puerto Madryn es abastecida en un 54% por la Central Hidroeléctrica Futaleufú (320 MW asignados contractualmente bajo concesión), 24% por el Parque Eólico Aluar (PEAL, 200 MW en operación) y 18% por ciclos combinados térmicos propios a gas natural. Sólo el 4% restante se toma de la red nacional (SADI/CAMMESA), blindando a la compañía ante fluctuaciones en las tarifas eléctricas spot.</w:t>
       </w:r>
     </w:p>
     <w:p>
@@ -1604,7 +1604,7 @@
           <w:color w:val="0F172A"/>
           <w:sz w:val="19"/>
         </w:rPr>
-        <w:t>2. Posición en el Primer Cuartil de Costos Globales: Con un costo en efectivo C1 de USD 1.680 por tonelada (percentil 29% de la curva global de costos CRU/Wood Mackenzie), Aluar se ubica entre los productores más eficientes del mundo, asegurando márgenes operativos positivos aún en los valles del ciclo del LME.</w:t>
+        <w:t>2. Posición en el Primer Cuartil de Costos Globales: Con un costo en efectivo C1 de USD 1.680 por tonelada (percentil 29% de la curva global de costos CRU/Wood Mackenzie), Aluar se ubica entre los productores más eficientes del mundo, manteniendo márgenes operativos positivos en fases contractivas del ciclo internacional.</w:t>
       </w:r>
     </w:p>
     <w:p>
@@ -1617,7 +1617,7 @@
           <w:color w:val="0F172A"/>
           <w:sz w:val="19"/>
         </w:rPr>
-        <w:t>3. Infraestructura Portuaria Exclusiva: Terminal portuaria propia de aguas profundas en Puerto Madryn para la descarga directa de bauxita/alúmina importada y despacho de exportaciones con economías de escala en fletes marítimos.</w:t>
+        <w:t>3. Terminal Portuaria Exclusiva: Muelle propio de aguas profundas en Puerto Madryn para la descarga directa de bauxita y alúmina importada y embarque de exportaciones con economías de escala en fletes.</w:t>
       </w:r>
     </w:p>
     <w:p>
@@ -1632,7 +1632,7 @@
           <w:color w:val="1E3A8A"/>
           <w:sz w:val="22"/>
         </w:rPr>
-        <w:t>1.4 Estrategia Corporativa: Certificación ASI y Mezcla de Valor Agregado</w:t>
+        <w:t>1.4 Estrategia Corporativa: Certificación ASI y Mezcla de Elaborados</w:t>
       </w:r>
     </w:p>
     <w:p>
@@ -1645,7 +1645,7 @@
           <w:color w:val="0F172A"/>
           <w:sz w:val="19"/>
         </w:rPr>
-        <w:t>Los objetivos estratégicos comprenden: (1) alcanzar el 100% de abastecimiento renovable mediante la Etapa V del Parque Eólico (PEAL V / La Flecha); (2) obtener la certificación ASI (Aluminium Stewardship Initiative) para capturar primas de precio por aluminio verde en la Unión Europea; y (3) defender la cuota en productos elaborados:</w:t>
+        <w:t>Los objetivos estratégicos comprenden: (1) alcanzar el 100% de abastecimiento renovable mediante la Etapa V del Parque Eólico (PEAL V / La Flecha); (2) obtener la certificación ASI (Aluminium Stewardship Initiative) para capturar primas de precio por aluminio verde en Europa; y (3) defender la cuota en productos elaborados:</w:t>
       </w:r>
     </w:p>
     <w:p>
@@ -2151,7 +2151,7 @@
           <w:color w:val="0F172A"/>
           <w:sz w:val="19"/>
         </w:rPr>
-        <w:t>• Fortalezas: Monopolio primario integrado en Argentina; 96% de energía autogenerada; costos C1 en primer cuartil mundial; ingresos 80% dolarizados.</w:t>
+        <w:t>• Fortalezas: Monopolio primario integrado en Argentina; 96% de energía autogenerada; costos C1 en primer cuartil mundial; ingresos 80% en moneda dura.</w:t>
       </w:r>
     </w:p>
     <w:p>
@@ -2164,7 +2164,7 @@
           <w:color w:val="0F172A"/>
           <w:sz w:val="19"/>
         </w:rPr>
-        <w:t>• Oportunidades: Captura de primas comerciales por certificación ASI; incentivos impositivos del RIGI para PEAL V; compresión adicional del riesgo soberano.</w:t>
+        <w:t>• Oportunidades: Primas comerciales por certificación ASI; beneficios impositivos del RIGI para PEAL V; compresión de la prima de riesgo soberano.</w:t>
       </w:r>
     </w:p>
     <w:p>
@@ -2177,7 +2177,7 @@
           <w:color w:val="0F172A"/>
           <w:sz w:val="19"/>
         </w:rPr>
-        <w:t>• Debilidades: Dependencia total de alúmina importada; capacidad nominal saturada al 100% (460 kt); apalancamiento transitorio por inversiones eólicas.</w:t>
+        <w:t>• Debilidades: Dependencia de alúmina importada; capacidad nominal operando al 100% (460 kt); apalancamiento transitorio por inversiones eólicas.</w:t>
       </w:r>
     </w:p>
     <w:p>
@@ -2190,7 +2190,7 @@
           <w:color w:val="0F172A"/>
           <w:sz w:val="19"/>
         </w:rPr>
-        <w:t>• Amenazas: Volatilidad cíclica del LME; apreciación del tipo de cambio real que encarece costos laborales en USD; sobrecapacidad de fundición en Asia.</w:t>
+        <w:t>• Amenazas: Ciclo internacional del LME; apreciación del tipo de cambio real que encarece costos laborales en USD; excedentes de fundición en Asia.</w:t>
       </w:r>
     </w:p>
     <w:p>
@@ -2220,7 +2220,7 @@
           <w:color w:val="0D233A"/>
           <w:sz w:val="18"/>
         </w:rPr>
-        <w:t>Tabla: Evolución de Indicadores Clave Auditados FY2020–FY2025 (USD MM)</w:t>
+        <w:t>Tabla: Evolución de Indicadores Financieros Auditados FY2020–FY2025 (USD MM)</w:t>
       </w:r>
     </w:p>
     <w:tbl>
@@ -3414,7 +3414,7 @@
           <w:color w:val="0F172A"/>
           <w:sz w:val="19"/>
         </w:rPr>
-        <w:t>Las proyecciones del modelo se apoyan en el marco macroeconómico de estabilización argentino, con convergencia inflacionaria y recuperación del PBI. La compresión del spread de riesgo soberano EMBI+ desde máximos de 2.400 pb en 2022 a 441 pb al cierre de julio de 2026 ejerce un impacto directo y favorable sobre la tasa de descuento del capital.</w:t>
+        <w:t>Las proyecciones del modelo se apoyan en el escenario de estabilización macroeconómica argentino, con convergencia inflacionaria y reactivación gradual de la actividad industrial. La compresión del spread de riesgo soberano EMBI+ desde máximos de 2.400 pb en 2022 a 441 pb al cierre de julio de 2026 reduce de forma directa la tasa de descuento requerida para el capital.</w:t>
       </w:r>
     </w:p>
     <w:tbl>
@@ -3579,7 +3579,7 @@
                 <w:color w:val="4A4A4A"/>
                 <w:sz w:val="16"/>
               </w:rPr>
-              <w:t>Figura 4: Compresión del Riesgo País (EMBI+): Descenso estructural del spread soberano desde 2.400 pb a 441 pb.</w:t>
+              <w:t>Figura 4: Compresión del Riesgo País (EMBI+): Descenso del spread soberano desde 2.400 pb a 441 pb.</w:t>
             </w:r>
           </w:p>
         </w:tc>
@@ -3615,7 +3615,7 @@
           <w:color w:val="0F172A"/>
           <w:sz w:val="19"/>
         </w:rPr>
-        <w:t>La proyección de ingresos descansa en la formulación microeconómica Ingresos = P × Q:</w:t>
+        <w:t>La proyección de ingresos descansa en la descomposición operativa Ingresos = P × Q:</w:t>
       </w:r>
     </w:p>
     <w:p>
@@ -3652,7 +3652,7 @@
           <w:color w:val="0F172A"/>
           <w:sz w:val="19"/>
         </w:rPr>
-        <w:t>En FY2026E los ingresos alcanzan USD 1.591,4 MM escalados por el nivel spot del LME en el 1T26 ($3.173,2/t). Para el horizonte explícito 2027E–2030E, el precio realizado converge linealmente a su valor de régimen de equilibrio de largo plazo:</w:t>
+        <w:t>En FY2026E los ingresos alcanzan USD 1.591,4 MM impulsados por el precio spot del LME en el 1T26 ($3.173,2/t). Para el período 2027E–2030E, el precio realizado converge linealmente a su nivel de equilibrio de largo plazo:</w:t>
       </w:r>
     </w:p>
     <w:p>
@@ -3689,7 +3689,7 @@
           <w:color w:val="0F172A"/>
           <w:sz w:val="19"/>
         </w:rPr>
-        <w:t>Se calibra el parámetro de eficiencia k sobre la observación real del 1T26 (Ventas = USD 416 MM, EBITDA = USD 106 MM, C1 = USD 1.680/t):</w:t>
+        <w:t>Se calibra el parámetro de eficiencia operativa k sobre los datos reales del 1T26 (Ventas = USD 416 MM, EBITDA = USD 106 MM, C1 = USD 1.680/t):</w:t>
       </w:r>
     </w:p>
     <w:p>
@@ -3726,7 +3726,7 @@
           <w:color w:val="0F172A"/>
           <w:sz w:val="19"/>
         </w:rPr>
-        <w:t>La variación de capital de trabajo se modela en base a la mediana histórica (NWC/Ventas = 49,42%):</w:t>
+        <w:t>Se proyecta la variación de capital de trabajo según la mediana histórica (NWC/Ventas = 49,42%):</w:t>
       </w:r>
     </w:p>
     <w:p>
@@ -3929,7 +3929,7 @@
                 <w:color w:val="4A4A4A"/>
                 <w:sz w:val="16"/>
               </w:rPr>
-              <w:t>Figura 5: Curva de Riesgo Soberano: Convergencia estocástica AR(1) frente al supuesto corporativo base (441 pb).</w:t>
+              <w:t>Figura 5: Trayectoria del Riesgo País: Proyección estocástica AR(1) frente al supuesto corporativo base (441 pb).</w:t>
             </w:r>
           </w:p>
         </w:tc>
@@ -3954,7 +3954,7 @@
                 <w:color w:val="4A4A4A"/>
                 <w:sz w:val="16"/>
               </w:rPr>
-              <w:t>Figura 6: Aluminio LME vs. DXY: Desacoplamiento cíclico y correlación negativa frente al índice del dólar global.</w:t>
+              <w:t>Figura 6: Aluminio LME vs. DXY: Relación inversa entre el commodity y el índice global del dólar.</w:t>
             </w:r>
           </w:p>
         </w:tc>
@@ -3995,7 +3995,7 @@
           <w:color w:val="1E3A8A"/>
           <w:sz w:val="22"/>
         </w:rPr>
-        <w:t>3.1 Desacoplamiento Cíclico: LME, DXY y Cobertura Cambiaria Natural</w:t>
+        <w:t>3.1 Comportamiento Cíclico: LME, DXY y Cobertura Operativa</w:t>
       </w:r>
     </w:p>
     <w:p>
@@ -4008,7 +4008,7 @@
           <w:color w:val="0F172A"/>
           <w:sz w:val="19"/>
         </w:rPr>
-        <w:t>Existe una correlación inversa estructural entre la cotización global de los commodities y el índice del dólar (DXY). Aluar cuenta con una cobertura natural: cuando el ciclo internacional del commodity se deprime y el dólar se fortalece, los episodios de devaluación del tipo de cambio real en Argentina licúan los costos operativos fijos en pesos (mano de obra y servicios locales), amortiguando la compresión de márgenes.</w:t>
+        <w:t>Existe una correlación inversa entre el precio internacional de los metales básicos y la fortaleza del dólar global (DXY). Aluar cuenta con una cobertura operativa natural: en fases contractivas del commodity acompañadas por apreciación del dólar, las correcciones del tipo de cambio real doméstico reducen los costos fijos en pesos (salarios y servicios), amortiguando la presión sobre el margen operativo.</w:t>
       </w:r>
     </w:p>
     <w:p>
@@ -4023,7 +4023,7 @@
           <w:color w:val="1E3A8A"/>
           <w:sz w:val="22"/>
         </w:rPr>
-        <w:t>3.2 Diagnóstico Econométrico: Test de Cointegración de Engle-Granger</w:t>
+        <w:t>3.2 Análisis Econométrico: Test de Cointegración de Engle-Granger</w:t>
       </w:r>
     </w:p>
     <w:p>
@@ -4036,7 +4036,7 @@
           <w:color w:val="0F172A"/>
           <w:sz w:val="19"/>
         </w:rPr>
-        <w:t>Se sometió la serie diaria de ALUA.BA (homogeneizada a USD vía CCL, N=2.355 ruedas, 2016–2026) y el futuro del LME a prueba de cointegración formal de Engle-Granger. El estadístico t = -2,29 (p = 0,38, valor crítico al 5% de -3,34) rechaza la cointegración estricta en niveles. No obstante, la elasticidad contemporánea es de 0,66 (R² = 0,12). Esto confirma que Aluar no es un activo puramente ligado al commodity ni puramente dependiente del riesgo argentino, sino un activo dual con dinámica mixta.</w:t>
+        <w:t>Se sometió la serie diaria de ALUA.BA (expresada en USD vía CCL, N=2.355 ruedas, período 2016–2026) y el futuro del LME a la prueba de cointegración de Engle-Granger. El estadístico t = -2,29 (p = 0,38, frente a un valor crítico del -3,34 al 5%) no permite afirmar cointegración estricta en niveles. Sin embargo, la elasticidad contemporánea se sitúa en 0,66 (R² = 0,12), confirmando que Aluar responde de forma combinada tanto al ciclo internacional del metal como a las condiciones macroeconómicas locales.</w:t>
       </w:r>
     </w:p>
     <w:tbl>
@@ -4176,7 +4176,7 @@
                 <w:color w:val="4A4A4A"/>
                 <w:sz w:val="16"/>
               </w:rPr>
-              <w:t>Figura 7: Producción Global de Aluminio: Participación de los principales países productores mundiales.</w:t>
+              <w:t>Figura 7: Producción Mundial de Aluminio: Participación de los principales países productores.</w:t>
             </w:r>
           </w:p>
         </w:tc>
@@ -4201,7 +4201,7 @@
                 <w:color w:val="4A4A4A"/>
                 <w:sz w:val="16"/>
               </w:rPr>
-              <w:t>Figura 8: Escala y Autogeneración: Comparativa de capacidad y abastecimiento energético propio frente a gigantes.</w:t>
+              <w:t>Figura 8: Capacidad y Autogeneración: Comparativa de escala y matriz energética propia frente a pares.</w:t>
             </w:r>
           </w:p>
         </w:tc>
@@ -4349,7 +4349,7 @@
                 <w:color w:val="4A4A4A"/>
                 <w:sz w:val="16"/>
               </w:rPr>
-              <w:t>Figura 9: Cuota de Mercado Doméstica: Participación del 60% en el mercado argentino frente a importaciones.</w:t>
+              <w:t>Figura 9: Participación de Mercado Local: Cuota del 60% de Aluar frente al 40% importado.</w:t>
             </w:r>
           </w:p>
         </w:tc>
@@ -4374,7 +4374,7 @@
                 <w:color w:val="4A4A4A"/>
                 <w:sz w:val="16"/>
               </w:rPr>
-              <w:t>Figura 10: Matriz Energética y Curva C1: Abastecimiento renovable y posición defensiva en el primer cuartil.</w:t>
+              <w:t>Figura 10: Matriz Renovable y Curva C1: Posicionamiento en el primer cuartil de costos de fundición.</w:t>
             </w:r>
           </w:p>
         </w:tc>
@@ -4400,7 +4400,7 @@
           <w:color w:val="0D233A"/>
           <w:sz w:val="26"/>
         </w:rPr>
-        <w:t>4. Gobernanza Corporativa, Marco Regulatorio y Posicionamiento ESG</w:t>
+        <w:t>4. Gobernanza Corporativa, Marco Regulatorio y Factores ESG</w:t>
       </w:r>
     </w:p>
     <w:p>
@@ -4415,7 +4415,7 @@
           <w:color w:val="1E3A8A"/>
           <w:sz w:val="22"/>
         </w:rPr>
-        <w:t>4.1 Estructura de Gobierno y Control Interno (Ley 26.831 / CNV)</w:t>
+        <w:t>4.1 Gobierno Corporativo y Transparencia (Ley 26.831 / CNV)</w:t>
       </w:r>
     </w:p>
     <w:p>
@@ -4428,7 +4428,7 @@
           <w:color w:val="0F172A"/>
           <w:sz w:val="19"/>
         </w:rPr>
-        <w:t>Aluar opera bajo el régimen de oferta pública de la CNV (Resolución General 797/2019). El Directorio está presidido por Javier Madanes Quintanilla. El Comité de Auditoría cuenta con mayoría de miembros independientes conforme al Art. 109 de la Ley 26.831, dictaminando sobre el control interno y transacciones con partes vinculadas como Hidroeléctrica Futaleufú S.A. (60,2%) y Transpa S.A. (20,4%), verificadas a precios y condiciones de mercado.</w:t>
+        <w:t>Aluar cotiza en el régimen de oferta pública de la CNV (Resolución General 797/2019). El Directorio está encabezado por Javier Madanes Quintanilla. El Comité de Auditoría cuenta con mayoría de directores independientes según el Art. 109 de la Ley 26.831, dictaminando sobre el sistema de control interno y transacciones con sociedades vinculadas como Hidroeléctrica Futaleufú S.A. (60,2%) y Transpa S.A. (20,4%), celebradas a precios de mercado.</w:t>
       </w:r>
     </w:p>
     <w:p>
@@ -4443,7 +4443,7 @@
           <w:color w:val="0D233A"/>
           <w:sz w:val="18"/>
         </w:rPr>
-        <w:t>Tabla: Scorecard Proxy de ESG y Gobernanza Corporativa</w:t>
+        <w:t>Tabla: Matriz de Evaluación de Factores Ambientales, Sociales y de Gobierno (ESG)</w:t>
       </w:r>
     </w:p>
     <w:tbl>
@@ -4519,7 +4519,7 @@
                 <w:color w:val="0D233A"/>
                 <w:sz w:val="17"/>
               </w:rPr>
-              <w:t>Métricas y Evidencia Observable</w:t>
+              <w:t>Indicadores Observables</w:t>
             </w:r>
           </w:p>
         </w:tc>
@@ -4547,7 +4547,7 @@
                 <w:color w:val="0D233A"/>
                 <w:sz w:val="17"/>
               </w:rPr>
-              <w:t>Evaluación Cualitativa</w:t>
+              <w:t>Evaluación</w:t>
             </w:r>
           </w:p>
         </w:tc>
@@ -4601,7 +4601,7 @@
                 <w:color w:val="0F172A"/>
                 <w:sz w:val="17"/>
               </w:rPr>
-              <w:t>78% renovable autogenerada. Huella &lt; 4 t CO2/t Al. Proceso de certificación ASI.</w:t>
+              <w:t>78% renovable propia. Huella &lt; 4 t CO2/t Al. Certificación ASI en proceso.</w:t>
             </w:r>
           </w:p>
         </w:tc>
@@ -4627,7 +4627,7 @@
                 <w:color w:val="0F172A"/>
                 <w:sz w:val="17"/>
               </w:rPr>
-              <w:t>Fuerte. Ventaja competitiva frente al arancel fronterizo de carbono europeo (CBAM).</w:t>
+              <w:t>Favorable. Ventaja competitiva frente al mecanismo de ajuste en frontera por carbono (CBAM).</w:t>
             </w:r>
           </w:p>
         </w:tc>
@@ -4681,7 +4681,7 @@
                 <w:color w:val="0F172A"/>
                 <w:sz w:val="17"/>
               </w:rPr>
-              <w:t>Principal empleador privado de Chubut (&gt; 6.200 empleos directos e indirectos). TRIR &lt; 1,0.</w:t>
+              <w:t>Principal empleador privado en Chubut (&gt; 6.200 puestos directos e indirectos). TRIR &lt; 1,0.</w:t>
             </w:r>
           </w:p>
         </w:tc>
@@ -4707,7 +4707,7 @@
                 <w:color w:val="0F172A"/>
                 <w:sz w:val="17"/>
               </w:rPr>
-              <w:t>Adecuada. Riguroso estándar de seguridad industrial y baja conflictividad laboral.</w:t>
+              <w:t>Adecuada. Estándares de seguridad industrial y baja tasa de siniestralidad.</w:t>
             </w:r>
           </w:p>
         </w:tc>
@@ -4761,7 +4761,7 @@
                 <w:color w:val="0F172A"/>
                 <w:sz w:val="17"/>
               </w:rPr>
-              <w:t>Concentración del 45,98% en el grupo de control. Auditoría externa por PwC e independencia de comités.</w:t>
+              <w:t>Concentración del 45,98% en el grupo de control. Auditoría externa por PwC y comités independientes.</w:t>
             </w:r>
           </w:p>
         </w:tc>
@@ -4787,7 +4787,7 @@
                 <w:color w:val="0F172A"/>
                 <w:sz w:val="17"/>
               </w:rPr>
-              <w:t>Moderada. Estabilidad estratégica de largo plazo con flotante acotado al 54,02%.</w:t>
+              <w:t>Estable. Continuidad estratégica con flotante del 54,02%.</w:t>
             </w:r>
           </w:p>
         </w:tc>
@@ -4810,7 +4810,7 @@
           <w:color w:val="1E3A8A"/>
           <w:sz w:val="22"/>
         </w:rPr>
-        <w:t>4.2 Mitigación del Impuesto Fronterizo por Carbono (CBAM de la UE)</w:t>
+        <w:t>4.2 Impacto del Ajuste de Carbono en Frontera (CBAM de la Unión Europea)</w:t>
       </w:r>
     </w:p>
     <w:p>
@@ -4823,7 +4823,7 @@
           <w:color w:val="0F172A"/>
           <w:sz w:val="19"/>
         </w:rPr>
-        <w:t>La intensidad de carbono de Aluar (&lt; 4 t CO2/t Al) se ubica muy por debajo del promedio global (~ 11 t CO2/t), dominado por fundiciones chinas e indias alimentadas a carbón. Esto le otorga una ventaja arancelaria neta estimada en USD 80–120 por tonelada bajo el esquema CBAM de la Unión Europea.</w:t>
+        <w:t>La reducida huella de carbono de Aluar (&lt; 4 t CO2/t Al) frente al promedio de la industria (~ 11 t CO2/t) le otorga una ventaja arancelaria neta estimada en USD 80–120 por tonelada bajo el esquema CBAM de la Unión Europea frente a productores alimentados con fuentes fósiles.</w:t>
       </w:r>
     </w:p>
     <w:p>
@@ -4856,7 +4856,7 @@
           <w:color w:val="1E3A8A"/>
           <w:sz w:val="22"/>
         </w:rPr>
-        <w:t>5.1 Múltiplos LTM vs. Forward: Compresión Post-Recuperación Operativa</w:t>
+        <w:t>5.1 Comparación de Múltiplos LTM y Forward</w:t>
       </w:r>
     </w:p>
     <w:p>
@@ -4869,7 +4869,7 @@
           <w:color w:val="0F172A"/>
           <w:sz w:val="19"/>
         </w:rPr>
-        <w:t>Aluar transa a un múltiplo EV/EBITDA LTM de 13,4x sobre el EBITDA deprimido de FY2025 (USD 163,3 MM), reflejando una prima aparente frente a comparables globales (mediana de 6,5x). Sin embargo, al valuar sobre el EBITDA proyectado normalizado de FY2026E (USD 391,2 MM), el múltiplo implícito de Aluar colapsa a 5,2x EV/EBITDA Forward, situando a la compañía con un descuento fundamental del 20%–25% respecto de pares como Alcoa (8,1x) y Norsk Hydro (6,5x).</w:t>
+        <w:t>Aluar cotiza a un múltiplo EV/EBITDA LTM de 13,4x sobre el resultado deprimido de FY2025 (USD 163,3 MM). Al normalizar la proyección sobre el EBITDA estimado de FY2026E (USD 391,2 MM), el múltiplo implícito desciende a 5,2x EV/EBITDA Forward, situando a la firma con un descuento del 20%–25% frente a comparables internacionales como Alcoa (8,1x) y Norsk Hydro (6,5x).</w:t>
       </w:r>
     </w:p>
     <w:tbl>
@@ -5009,7 +5009,7 @@
                 <w:color w:val="4A4A4A"/>
                 <w:sz w:val="16"/>
               </w:rPr>
-              <w:t>Figura 11: Múltiplos EV/EBITDA vs. Margen: Posicionamiento de Aluar frente a pares internacionales (Alcoa, Hydro, Chalco).</w:t>
+              <w:t>Figura 11: EV/EBITDA vs. Margen: Ubicación de Aluar frente a pares internacionales (Alcoa, Hydro, Chalco).</w:t>
             </w:r>
           </w:p>
         </w:tc>
@@ -5034,7 +5034,7 @@
                 <w:color w:val="4A4A4A"/>
                 <w:sz w:val="16"/>
               </w:rPr>
-              <w:t>Figura 12: EBITDA Histórico y Proyectado: Recuperación operativa y desapalancamiento post-pico de CAPEX PEAL V.</w:t>
+              <w:t>Figura 12: EBITDA Histórico y Proyectado: Recuperación operativa y desapalancamiento tras el pico de CAPEX.</w:t>
             </w:r>
           </w:p>
         </w:tc>
@@ -5057,7 +5057,7 @@
           <w:color w:val="1E3A8A"/>
           <w:sz w:val="22"/>
         </w:rPr>
-        <w:t>5.2 Desapalancamiento Post-Pico de Inversión Eólica</w:t>
+        <w:t>5.2 Trayectoria de Desapalancamiento Financiero</w:t>
       </w:r>
     </w:p>
     <w:p>
@@ -5070,7 +5070,7 @@
           <w:color w:val="0F172A"/>
           <w:sz w:val="19"/>
         </w:rPr>
-        <w:t>El CAPEX de FY2025 (USD 243,9 MM) elevó la Deuda Neta a USD 525,8 MM (3,22x EBITDA). Con el cese del desembolso intensivo y la estabilización del CAPEX de mantenimiento en ~USD 90–103 MM/año, la generación de caja proyectada comprime el ratio Deuda Neta / EBITDA a &lt;1,0x hacia FY2028E.</w:t>
+        <w:t>El desembolso en bienes de uso durante FY2025 (USD 243,9 MM) elevó la Deuda Neta a USD 525,8 MM (3,22x EBITDA). Con la moderación de inversiones hacia niveles de mantenimiento (~USD 90–103 MM/año), el flujo libre de caja proyectado permite recomprimir la Deuda Neta / EBITDA a &lt;1,0x hacia FY2028E.</w:t>
       </w:r>
     </w:p>
     <w:p>
@@ -5085,7 +5085,7 @@
           <w:color w:val="0D233A"/>
           <w:sz w:val="18"/>
         </w:rPr>
-        <w:t>Tabla: Análisis de Comparables Globales de la Industria del Aluminio (julio-2026)</w:t>
+        <w:t>Tabla: Múltiplos Financieros de Empresas Comparables del Sector (julio-2026)</w:t>
       </w:r>
     </w:p>
     <w:tbl>
@@ -5803,7 +5803,7 @@
                 <w:color w:val="0F172A"/>
                 <w:sz w:val="17"/>
               </w:rPr>
-              <w:t>Mediana Industria</w:t>
+              <w:t>Mediana de Pares</w:t>
             </w:r>
           </w:p>
         </w:tc>
@@ -5932,7 +5932,7 @@
           <w:color w:val="0D233A"/>
           <w:sz w:val="26"/>
         </w:rPr>
-        <w:t>6. Costo de Capital (WACC) y Fundamentación Económica del Factor λ</w:t>
+        <w:t>6. Costo Promedio Ponderado del Capital (WACC) y Factor λ</w:t>
       </w:r>
     </w:p>
     <w:p>
@@ -5947,7 +5947,7 @@
           <w:color w:val="1E3A8A"/>
           <w:sz w:val="22"/>
         </w:rPr>
-        <w:t>6.1 Formulación Completa del WACC y Parámetros del Modelo</w:t>
+        <w:t>6.1 Formulación y Estimación del WACC</w:t>
       </w:r>
     </w:p>
     <w:p>
@@ -5971,7 +5971,7 @@
           <w:color w:val="4A4A4A"/>
           <w:sz w:val="18"/>
         </w:rPr>
-        <w:t xml:space="preserve">    (WACC Canónico)</w:t>
+        <w:t xml:space="preserve">    (Formulación WACC)</w:t>
       </w:r>
     </w:p>
     <w:p>
@@ -5995,7 +5995,7 @@
           <w:color w:val="4A4A4A"/>
           <w:sz w:val="18"/>
         </w:rPr>
-        <w:t xml:space="preserve">    (Sustitución WACC)</w:t>
+        <w:t xml:space="preserve">    (Cálculo del WACC)</w:t>
       </w:r>
     </w:p>
     <w:p>
@@ -6010,7 +6010,7 @@
           <w:color w:val="1E3A8A"/>
           <w:sz w:val="22"/>
         </w:rPr>
-        <w:t>6.2 Secuencia del Beta en Cuatro Pasos (OLS → Blume → Hamada)</w:t>
+        <w:t>6.2 Deducción del Beta en Cuatro Pasos (OLS → Blume → Hamada)</w:t>
       </w:r>
     </w:p>
     <w:p>
@@ -6023,7 +6023,7 @@
           <w:color w:val="0F172A"/>
           <w:sz w:val="19"/>
         </w:rPr>
-        <w:t>1. Beta OLS Histórico: Regresión lineal diaria de 10 años (N=2.376 ruedas) de ALUA (USD vía CCL) contra el S&amp;P 500 arrojó β_OLS = 0,8420 (SE = 0,0563, R² = 8,60%).</w:t>
+        <w:t>1. Beta OLS Histórico: Regresión lineal diaria de 10 años (N=2.376 ruedas) de ALUA (en USD CCL) contra el índice S&amp;P 500 arrojó β_OLS = 0,8420 (SE = 0,0563, R² = 8,60%).</w:t>
       </w:r>
     </w:p>
     <w:p>
@@ -6036,7 +6036,7 @@
           <w:color w:val="0F172A"/>
           <w:sz w:val="19"/>
         </w:rPr>
-        <w:t>2. Ajuste de Blume (1975): Corrección por tendencia a la media del riesgo sistemático: β_Blume = (2/3) × 0,8420 + 1/3 = 0,8947.</w:t>
+        <w:t>2. Ajuste de Blume (1975): Corrección por reversión a la media del riesgo sistemático: β_Blume = (2/3) × 0,8420 + 1/3 = 0,8947.</w:t>
       </w:r>
     </w:p>
     <w:p>
@@ -6049,7 +6049,7 @@
           <w:color w:val="0F172A"/>
           <w:sz w:val="19"/>
         </w:rPr>
-        <w:t>3. Desapalancamiento por Hamada (1972): Con ratio D/E histórico mediano (0,5036): β_U = 0,8947 / [1 + (1 - 0,35) × 0,5036] = 0,6745.</w:t>
+        <w:t>3. Desapalancamiento por Hamada (1972): Con el ratio D/E histórico mediano (0,5036): β_U = 0,8947 / [1 + (1 - 0,35) × 0,5036] = 0,6745.</w:t>
       </w:r>
     </w:p>
     <w:p>
@@ -6202,7 +6202,7 @@
                 <w:color w:val="4A4A4A"/>
                 <w:sz w:val="16"/>
               </w:rPr>
-              <w:t>Figura 13: Secuencia del Beta en 4 Pasos: OLS (0,842) → Blume (0,895) → Desapalancado (0,675) → Hamada (β_L = 0,8876).</w:t>
+              <w:t>Figura 13: Secuencia del Beta: OLS (0,842) → Blume (0,895) → Desapalancado (0,675) → Hamada (β_L = 0,8876).</w:t>
             </w:r>
           </w:p>
         </w:tc>
@@ -6227,7 +6227,7 @@
                 <w:color w:val="4A4A4A"/>
                 <w:sz w:val="16"/>
               </w:rPr>
-              <w:t>Figura 14: Descomposición WACC Canónico: Ke = 9,30%, Kd = 2,47%, resultando en un WACC de 7,06% en USD.</w:t>
+              <w:t>Figura 14: Composición del WACC: Costo del equity Ke = 9,30%, deuda post-tax Kd = 2,47%, resultando en 7,06%.</w:t>
             </w:r>
           </w:p>
         </w:tc>
@@ -6250,7 +6250,7 @@
           <w:color w:val="1E3A8A"/>
           <w:sz w:val="22"/>
         </w:rPr>
-        <w:t>6.3 Fundamentación Económica del Factor λ = 0,20</w:t>
+        <w:t>6.3 Fundamentación del Factor de Exposición Soberana λ = 0,20</w:t>
       </w:r>
     </w:p>
     <w:p>
@@ -6274,7 +6274,7 @@
           <w:color w:val="4A4A4A"/>
           <w:sz w:val="18"/>
         </w:rPr>
-        <w:t xml:space="preserve">    (CAPM con λ)</w:t>
+        <w:t xml:space="preserve">    (CAPM con Factor λ)</w:t>
       </w:r>
     </w:p>
     <w:p>
@@ -6287,7 +6287,7 @@
           <w:color w:val="0F172A"/>
           <w:sz w:val="19"/>
         </w:rPr>
-        <w:t>El factor λ = 0,20 coincide con la proporción de ingresos destinados al mercado interno (20%). Dado que el 80% restante se exporta a precios LME y los costos operativos fijos están denominados en pesos (mano de obra y fletes), una devaluación del peso licúa los costos en dólares de Aluar, otorgando una cobertura natural contra el riesgo soberano.</w:t>
+        <w:t>El factor λ = 0,20 equivale a la porción de ventas colocadas en el mercado doméstico (20%). Puesto que el 80% restante se exporta a cotizaciones LME y los costos operativos fijos están denominados en pesos (salarios e insumos locales), los ajustes cambiarios licúan costos en dólares, actuando como cobertura natural frente al riesgo país.</w:t>
       </w:r>
     </w:p>
     <w:p>
@@ -6302,7 +6302,7 @@
           <w:color w:val="0D233A"/>
           <w:sz w:val="18"/>
         </w:rPr>
-        <w:t>Tabla: Análisis de Sensibilidad: Factor λ de Exposición al Riesgo País</w:t>
+        <w:t>Tabla: Sensibilidad del Costo de Capital y Precio Objetivo ante Variaciones en λ</w:t>
       </w:r>
     </w:p>
     <w:tbl>
@@ -6380,7 +6380,7 @@
                 <w:color w:val="0D233A"/>
                 <w:sz w:val="17"/>
               </w:rPr>
-              <w:t>λ = 0,20 (Base)</w:t>
+              <w:t>λ = 0,20 (Caso Base)</w:t>
             </w:r>
           </w:p>
         </w:tc>
@@ -6464,7 +6464,7 @@
                 <w:color w:val="0D233A"/>
                 <w:sz w:val="17"/>
               </w:rPr>
-              <w:t>λ = 1,00 (Tradicional)</w:t>
+              <w:t>λ = 1,00 (Sin Cobertura)</w:t>
             </w:r>
           </w:p>
         </w:tc>
@@ -7025,7 +7025,7 @@
                 <w:color w:val="0F172A"/>
                 <w:sz w:val="17"/>
               </w:rPr>
-              <w:t>Upside vs. Spot (ARS 982,50)</w:t>
+              <w:t>Retorno Esperado vs. Spot (ARS 982,50)</w:t>
             </w:r>
           </w:p>
         </w:tc>
@@ -7155,7 +7155,7 @@
           <w:color w:val="0D233A"/>
           <w:sz w:val="26"/>
         </w:rPr>
-        <w:t>7. Análisis de Creación de Valor (EVA) y Disciplina de Convergencia Terminal</w:t>
+        <w:t>7. Creación de Valor Económico (EVA) y Disciplina Terminal</w:t>
       </w:r>
     </w:p>
     <w:p>
@@ -7170,7 +7170,7 @@
           <w:color w:val="1E3A8A"/>
           <w:sz w:val="22"/>
         </w:rPr>
-        <w:t>7.1 Dinámica del EVA y Efecto del Capital Invertido en Obras en Curso</w:t>
+        <w:t>7.1 Evolución del EVA y Efecto del Capital Invertido</w:t>
       </w:r>
     </w:p>
     <w:p>
@@ -7183,7 +7183,7 @@
           <w:color w:val="0F172A"/>
           <w:sz w:val="19"/>
         </w:rPr>
-        <w:t>El Valor Económico Agregado (EVA_t = (ROIC_t - WACC) × NOA_{t-1}) refleja la rentabilidad del capital operativo. En FY2025 el EVA se situó en -USD 60,3 MM debido a la incorporación de USD 243,9 MM en activos eólicos al capital invertido (NOA = USD 1.704,3 MM) antes de que comiencen a generar ahorros operativos plenos.</w:t>
+        <w:t>El Valor Económico Agregado (EVA_t = (ROIC_t - WACC) × NOA_{t-1}) mide la generación de rentabilidad económica sobre los activos operativos netos. En FY2025 el EVA se situó en -USD 60,3 MM debido a la incorporación de USD 243,9 MM en activos eólicos al capital invertido (NOA = USD 1.704,3 MM) en forma previa a su plena entrada en régimen operativo.</w:t>
       </w:r>
     </w:p>
     <w:p>
@@ -7198,7 +7198,7 @@
           <w:color w:val="0D233A"/>
           <w:sz w:val="18"/>
         </w:rPr>
-        <w:t>Tabla: Matriz Histórica y Proyectada de Creación de Valor (EVA, USD MM)</w:t>
+        <w:t>Tabla: Trayectoria Histórica y Proyectada de Creación de Valor (EVA, USD MM)</w:t>
       </w:r>
     </w:p>
     <w:tbl>
@@ -8762,7 +8762,7 @@
           <w:color w:val="1E3A8A"/>
           <w:sz w:val="22"/>
         </w:rPr>
-        <w:t>7.2 Distinción Metodológica: Caso Base Dumrauf vs. Variante Damodaran</w:t>
+        <w:t>7.2 Criterios Metodológicos: Caso Base Dumrauf vs. Cota de Reinversión Damodaran</w:t>
       </w:r>
     </w:p>
     <w:p>
@@ -8775,7 +8775,7 @@
           <w:color w:val="0F172A"/>
           <w:sz w:val="19"/>
         </w:rPr>
-        <w:t>• Modelo Canónico Base (Dumrauf, Cap. 14): En estado estacionario de capacidad saturada (460 kt), CAPEX = D&amp;A y ΔNWC = 0, por lo que FCFF_terminal = NOPAT_2030 = USD 135,5 MM. El valor terminal es TV = (135,5 × 1,02) / (0,0706 - 0,02) = USD 2.731,4 MM, arrojando el target oficial de ARS 1.236,00.</w:t>
+        <w:t>• Caso Base Oficial (Dumrauf, Cap. 14): En estado estacionario a plena capacidad (460 kt), CAPEX = D&amp;A y ΔNWC = 0, por lo que FCFF_terminal = NOPAT_2030 = USD 135,5 MM. El valor terminal descontado resulta TV = (135,5 × 1,02) / (0,0706 - 0,02) = USD 2.731,4 MM, determinando el precio objetivo oficial de ARS 1.236,00.</w:t>
       </w:r>
     </w:p>
     <w:p>
@@ -8788,7 +8788,7 @@
           <w:color w:val="0F172A"/>
           <w:sz w:val="19"/>
         </w:rPr>
-        <w:t>• Variante de Robustez Académica (Damodaran, ROIC → WACC): Si se asume reinversión implícita RR = g / WACC = 2,0% / 7,06% = 28,3%, el flujo terminal se ajusta a NOPAT × (1 - RR) = USD 97,1 MM, resultando en un precio objetivo de ARS 993,00, que se incluye como cota inferior de prudencia.</w:t>
+        <w:t>• Cota de Reinversión (Damodaran, ROIC → WACC): Asumiendo una tasa de reinversión implícita RR = g / WACC = 2,0% / 7,06% = 28,3%, el flujo terminal se ajusta a NOPAT × (1 - RR) = USD 97,1 MM, arrojando un precio objetivo de ARS 993,00, que se adopta como cota conservadora de control.</w:t>
       </w:r>
     </w:p>
     <w:p>
@@ -8821,7 +8821,7 @@
           <w:color w:val="1E3A8A"/>
           <w:sz w:val="22"/>
         </w:rPr>
-        <w:t>8.1 Estructura del Enterprise Value y Concentración en el Valor Terminal</w:t>
+        <w:t>8.1 Composición del Enterprise Value</w:t>
       </w:r>
     </w:p>
     <w:p>
@@ -8834,7 +8834,7 @@
           <w:color w:val="0F172A"/>
           <w:sz w:val="19"/>
         </w:rPr>
-        <w:t>El Enterprise Value resultante asciende a USD 3.951 MM. El valor presente de los flujos explícitos (2026E–2030E) representa USD 680 MM (17,2% del EV), mientras que el Valor Terminal descontado aporta USD 2.902 MM (73,4% del EV), consistente con la naturaleza intensiva en capital de un activo industrial con vida útil indefinida. Deduciendo la Deuda Financiera Neta auditada de USD 525,8 MM y sumando activos no operativos, se obtiene un Equity Value de USD 2.186 MM, equivalente a ARS 1.236,00 por acción al tipo de cambio CCL de 1.584,25.</w:t>
+        <w:t>El Enterprise Value estimado asciende a USD 3.951 MM. Los flujos de fondos explícitos (2026E–2030E) aportan USD 680 MM (17,2% del EV), mientras que el Valor Terminal representa USD 2.902 MM (73,4% del EV), reflejando la vida útil indefinida de los activos de fundición. Deduciendo la Deuda Neta auditada de USD 525,8 MM y sumando activos no operativos, se obtiene un Equity Value de USD 2.186 MM, equivalente a ARS 1.236,00 por acción al tipo de cambio CCL de 1.584,25.</w:t>
       </w:r>
     </w:p>
     <w:tbl>
@@ -8999,7 +8999,7 @@
                 <w:color w:val="4A4A4A"/>
                 <w:sz w:val="16"/>
               </w:rPr>
-              <w:t>Figura 16: Días de Capital de Trabajo: Evolución de DIO, DSO, DPO y Ciclo de Conversión de Efectivo (CCC).</w:t>
+              <w:t>Figura 16: Capital de Trabajo Operativo: Trayectoria de DIO, DSO, DPO y Ciclo de Conversión de Efectivo (CCC).</w:t>
             </w:r>
           </w:p>
         </w:tc>
@@ -9022,7 +9022,7 @@
           <w:color w:val="1E3A8A"/>
           <w:sz w:val="22"/>
         </w:rPr>
-        <w:t>8.2 Dinámica del Ciclo de Conversión de Efectivo (CCC)</w:t>
+        <w:t>8.2 Evolución del Ciclo de Conversión de Efectivo (CCC)</w:t>
       </w:r>
     </w:p>
     <w:p>
@@ -9035,7 +9035,7 @@
           <w:color w:val="0F172A"/>
           <w:sz w:val="19"/>
         </w:rPr>
-        <w:t>El Ciclo de Conversión de Efectivo se comprime desde 79 días en FY2023 a 64 días proyectados, impulsado por la reducción en días de inventario (DIO) y optimización en días de cobranza (DSO), liberando capital de trabajo operativo para el servicio de la deuda.</w:t>
+        <w:t>El Ciclo de Conversión de Efectivo se comprime desde 79 días en FY2023 a 64 días proyectados, producto de la normalización en días de inventario (DIO) y cobranza (DSO), favoreciendo la liquidez para el servicio de pasivos.</w:t>
       </w:r>
     </w:p>
     <w:p>
@@ -9053,7 +9053,7 @@
           <w:color w:val="0D233A"/>
           <w:sz w:val="26"/>
         </w:rPr>
-        <w:t>9. Análisis Estratégico DuPont y Frameworks Industriales</w:t>
+        <w:t>9. Análisis Estratégico DuPont y Fuerzas Competitivas</w:t>
       </w:r>
     </w:p>
     <w:p>
@@ -9105,7 +9105,7 @@
           <w:color w:val="0F172A"/>
           <w:sz w:val="19"/>
         </w:rPr>
-        <w:t>En FY2025, la carga impositiva cayó drásticamente a 15,67% (alícuota efectiva del 84,3% por ajuste por inflación impositivo NIC 29), deprimiendo el ROE al 0,83% pese a que el margen operativo EBIT se mantuvo sólido en 8,44%.</w:t>
+        <w:t>En FY2025, el factor impositivo se redujo a 15,67% (alícuota efectiva del 84,3% por el impacto del ajuste por inflación impositivo NIC 29), situando el ROE en 0,83% aun cuando el margen operativo EBIT se ubicó en 8,44%.</w:t>
       </w:r>
     </w:p>
     <w:p>
@@ -9172,7 +9172,7 @@
                 <w:color w:val="0D233A"/>
                 <w:sz w:val="17"/>
               </w:rPr>
-              <w:t>Factor DuPont</w:t>
+              <w:t>Componente DuPont</w:t>
             </w:r>
           </w:p>
         </w:tc>
@@ -10112,7 +10112,7 @@
           <w:color w:val="0F172A"/>
           <w:sz w:val="19"/>
         </w:rPr>
-        <w:t>• Amenaza de Nuevos Entrantes (Muy Baja): Intensidad de capital requerida (&gt; USD 2.500 MM para un nuevo smelter) y barrera regulatoria insalvable en concesiones hidroeléctricas.</w:t>
+        <w:t>• Amenaza de Nuevos Entrantes (Muy Baja): Elevada inversión de capital (&gt; USD 2.500 MM para un complejo nuevo) y acceso restringido a fuentes hidroeléctricas dedicadas.</w:t>
       </w:r>
     </w:p>
     <w:p>
@@ -10125,7 +10125,7 @@
           <w:color w:val="0F172A"/>
           <w:sz w:val="19"/>
         </w:rPr>
-        <w:t>• Poder de Negociación de Proveedores (Bajo a Medio): Dependencia de bauxita/alúmina internacional mitigada por diversificación de orígenes marítimos; energía 96% autogenerada.</w:t>
+        <w:t>• Poder de Negociación de Proveedores (Bajo a Medio): Concentración en alúmina importada mitigada por contratos de suministro diversificados; insumo energético 96% autogenerado.</w:t>
       </w:r>
     </w:p>
     <w:p>
@@ -10138,7 +10138,7 @@
           <w:color w:val="0F172A"/>
           <w:sz w:val="19"/>
         </w:rPr>
-        <w:t>• Poder de Negociación de Clientes (Bajo): Mercado externo atomizado con precios tomadores LME; posición monopólica del 60% en el mercado local.</w:t>
+        <w:t>• Poder de Negociación de Clientes (Bajo): Exportaciones colocadas a precios internacionales tomadores LME; cuota del 60% en el mercado doméstico.</w:t>
       </w:r>
     </w:p>
     <w:p>
@@ -10151,7 +10151,7 @@
           <w:color w:val="0F172A"/>
           <w:sz w:val="19"/>
         </w:rPr>
-        <w:t>• Amenaza de Sustitutos (Baja): El aluminio conserva ventajas insustituibles en relación peso-resistencia, conductividad y reciclabilidad infinita frente al acero y polímeros.</w:t>
+        <w:t>• Amenaza de Sustitutos (Baja): Propiedades mecánicas y reciclabilidad del aluminio difíciles de reemplazar en extrusión estructural y transporte.</w:t>
       </w:r>
     </w:p>
     <w:p>
@@ -10164,7 +10164,7 @@
           <w:color w:val="0F172A"/>
           <w:sz w:val="19"/>
         </w:rPr>
-        <w:t>• Rivalidad de la Industria (Media): Competencia global por costos marginales; blindaje defensivo en el primer cuartil C1.</w:t>
+        <w:t>• Rivalidad Competitiva (Media): Competencia internacional por costos; protección operativa en el primer cuartil C1.</w:t>
       </w:r>
     </w:p>
     <w:p>
@@ -10177,7 +10177,7 @@
           <w:color w:val="0F172A"/>
           <w:sz w:val="19"/>
         </w:rPr>
-        <w:t>• Análisis PESTEL / Régimen RIGI: El marco RIGI reduce la tasa del impuesto a las ganancias al 25% para nuevos proyectos eólicos, exime de aranceles de importación a bienes de capital y garantiza estabilidad cambiaria, reduciendo el costo de capital de expansiones futuras.</w:t>
+        <w:t>• Marco Regulatorio / Régimen RIGI: El Régimen de Incentivos para Grandes Inversiones reduce la tasa corporativa del impuesto a las ganancias al 25% para nuevos desarrollos eólicos y elimina aranceles de importación en bienes de capital, optimizando el rendimiento de expansiones futuras.</w:t>
       </w:r>
     </w:p>
     <w:p>
@@ -10210,7 +10210,7 @@
           <w:color w:val="1E3A8A"/>
           <w:sz w:val="22"/>
         </w:rPr>
-        <w:t>10.1 Evolución Operativa y Solvencia Crediticia</w:t>
+        <w:t>10.1 Desempeño Operativo y Cobertura de Intereses</w:t>
       </w:r>
     </w:p>
     <w:p>
@@ -10223,7 +10223,7 @@
           <w:color w:val="0F172A"/>
           <w:sz w:val="19"/>
         </w:rPr>
-        <w:t>La evolución financiera auditada evidencia la resiliencia de la estructura de costos de Aluar a través de las fluctuaciones del ciclo. La cobertura de intereses (EBIT/Intereses) se mantuvo en un saludable 3,53x en FY2025 incluso en el pico de endeudamiento financiero, con ratios de liquidez corriente superiores a 1,40x:</w:t>
+        <w:t>La serie histórica auditada demuestra la solidez operativa de Aluar en distintos momentos del ciclo macroeconómico. El ratio de cobertura de intereses (EBIT/Intereses) cerró en 3,53x en FY2025 tras el pico de endeudamiento financiero, con ratios de liquidez corriente por encima de 1,40x:</w:t>
       </w:r>
     </w:p>
     <w:p>
@@ -10238,7 +10238,7 @@
           <w:color w:val="0D233A"/>
           <w:sz w:val="18"/>
         </w:rPr>
-        <w:t>Tabla: Histórico Financiero y Ratios Operativos de Aluar S.A.I.C. (USD MM)</w:t>
+        <w:t>Tabla: Estados Financieros y Ratios Operativos Históricos de Aluar (USD MM)</w:t>
       </w:r>
     </w:p>
     <w:tbl>
@@ -10290,7 +10290,7 @@
                 <w:color w:val="0D233A"/>
                 <w:sz w:val="17"/>
               </w:rPr>
-              <w:t>Métrica / Año</w:t>
+              <w:t>Métrica / Ejercicio</w:t>
             </w:r>
           </w:p>
         </w:tc>
@@ -13082,7 +13082,7 @@
           <w:color w:val="1E3A8A"/>
           <w:sz w:val="22"/>
         </w:rPr>
-        <w:t>11.1 Estructura del Modelo DCF y Valoración de la Opción Real PEAL V</w:t>
+        <w:t>11.1 Estructura del Modelo DCF y Valor de la Opción Real PEAL V</w:t>
       </w:r>
     </w:p>
     <w:p>
@@ -13119,7 +13119,7 @@
           <w:color w:val="0F172A"/>
           <w:sz w:val="19"/>
         </w:rPr>
-        <w:t>• Precio Objetivo DCF Base (Determinístico): ARS 1.236,00 por acción (USD 0,78, +25,8% Upside).</w:t>
+        <w:t>• Precio Objetivo DCF Caso Base: ARS 1.236,00 por acción (USD 0,78, +25,8% de retorno esperado).</w:t>
       </w:r>
     </w:p>
     <w:p>
@@ -13132,7 +13132,7 @@
           <w:color w:val="0F172A"/>
           <w:sz w:val="19"/>
         </w:rPr>
-        <w:t>• Valoración de la Opción Real PEAL V por LSMC: Modela la flexibilidad americana de inversión en 312 MW eólicos mediante regresión por mínimos cuadrados de Longstaff-Schwartz (2001) sobre polinomios de Laguerre, aportando una prima aditiva de +ARS 19,60 por acción (+USD 0,01).</w:t>
+        <w:t>• Opción Real PEAL V (Longstaff-Schwartz): Valúa la flexibilidad gerencial de diferir o ejecutar 312 MW eólicos adicionales mediante simulación por mínimos cuadrados (LSMC) sobre polinomios de Laguerre, aportando un valor aditivo de +ARS 19,60 por acción (+USD 0,01).</w:t>
       </w:r>
     </w:p>
     <w:p>
@@ -13145,7 +13145,7 @@
           <w:color w:val="0F172A"/>
           <w:sz w:val="19"/>
         </w:rPr>
-        <w:t>• Precio Objetivo Integrado (Base + Opción Real): ARS 1.255,60 por acción (USD 0,79, +27,8% Upside).</w:t>
+        <w:t>• Precio Objetivo Integrado (Base + Opción Real): ARS 1.255,60 por acción (USD 0,79, +27,8% de retorno esperado).</w:t>
       </w:r>
     </w:p>
     <w:tbl>
@@ -13285,7 +13285,7 @@
                 <w:color w:val="4A4A4A"/>
                 <w:sz w:val="16"/>
               </w:rPr>
-              <w:t>Figura 17: Test de Estrés Soberano: Impacto sobre WACC y Target en escenario de EMBI+ a 2.400 pb.</w:t>
+              <w:t>Figura 17: Sensibilidad al Riesgo Soberano: Impacto sobre WACC y Target en escenario de EMBI+ a 2.400 pb.</w:t>
             </w:r>
           </w:p>
         </w:tc>
@@ -13310,7 +13310,7 @@
                 <w:color w:val="4A4A4A"/>
                 <w:sz w:val="16"/>
               </w:rPr>
-              <w:t>Figura 18: Football Field de Valuación: Rango de precios intrínsecos por metodología vs. cotización Spot.</w:t>
+              <w:t>Figura 18: Rango de Precios Intrínsecos: Comparativa de estimaciones metodológicas vs. cotización Spot.</w:t>
             </w:r>
           </w:p>
         </w:tc>
@@ -13333,7 +13333,7 @@
           <w:color w:val="1E3A8A"/>
           <w:sz w:val="22"/>
         </w:rPr>
-        <w:t>11.2 Marco de Escenarios Ponderados (Bear / Base / Bull)</w:t>
+        <w:t>11.2 Marco de Escenarios Ponderados (Pesimista / Base / Optimista)</w:t>
       </w:r>
     </w:p>
     <w:p>
@@ -13348,7 +13348,7 @@
           <w:color w:val="0D233A"/>
           <w:sz w:val="18"/>
         </w:rPr>
-        <w:t>Tabla: Marco de Escenarios Ponderados: Bear / Base / Bull</w:t>
+        <w:t>Tabla: Marco de Escenarios: Supuestos Operativos y Precios Objetivos Resultantes</w:t>
       </w:r>
     </w:p>
     <w:tbl>
@@ -13397,7 +13397,7 @@
                 <w:color w:val="0D233A"/>
                 <w:sz w:val="17"/>
               </w:rPr>
-              <w:t>Variable / Factor</w:t>
+              <w:t>Variable</w:t>
             </w:r>
           </w:p>
         </w:tc>
@@ -13425,7 +13425,7 @@
                 <w:color w:val="0D233A"/>
                 <w:sz w:val="17"/>
               </w:rPr>
-              <w:t>Bear (25%)</w:t>
+              <w:t>Pesimista (25%)</w:t>
             </w:r>
           </w:p>
         </w:tc>
@@ -13481,7 +13481,7 @@
                 <w:color w:val="0D233A"/>
                 <w:sz w:val="17"/>
               </w:rPr>
-              <w:t>Bull (25%)</w:t>
+              <w:t>Optimista (25%)</w:t>
             </w:r>
           </w:p>
         </w:tc>
@@ -13535,7 +13535,7 @@
                 <w:color w:val="0F172A"/>
                 <w:sz w:val="17"/>
               </w:rPr>
-              <w:t>Reversión hacia cash cost global (~USD 1.900/t).</w:t>
+              <w:t>Caída hacia costo marginal global (~USD 1.900/t).</w:t>
             </w:r>
           </w:p>
         </w:tc>
@@ -13561,7 +13561,7 @@
                 <w:color w:val="0F172A"/>
                 <w:sz w:val="17"/>
               </w:rPr>
-              <w:t>Media de equilibrio OU (USD 2.450–2.814/t).</w:t>
+              <w:t>Nivel medio de equilibrio OU (USD 2.450–2.814/t).</w:t>
             </w:r>
           </w:p>
         </w:tc>
@@ -13587,7 +13587,7 @@
                 <w:color w:val="0F172A"/>
                 <w:sz w:val="17"/>
               </w:rPr>
-              <w:t>LME sostenido &gt; USD 3.000/t por déficit global.</w:t>
+              <w:t>LME sostenido &gt; USD 3.000/t por déficit de oferta.</w:t>
             </w:r>
           </w:p>
         </w:tc>
@@ -13641,7 +13641,7 @@
                 <w:color w:val="0F172A"/>
                 <w:sz w:val="17"/>
               </w:rPr>
-              <w:t>Repunte soberano a &gt; 800 pb.</w:t>
+              <w:t>Rebote soberano a &gt; 800 pb.</w:t>
             </w:r>
           </w:p>
         </w:tc>
@@ -13667,7 +13667,7 @@
                 <w:color w:val="0F172A"/>
                 <w:sz w:val="17"/>
               </w:rPr>
-              <w:t>Convergencia a largo plazo (≈ 441 pb).</w:t>
+              <w:t>Estabilización a largo plazo (≈ 441 pb).</w:t>
             </w:r>
           </w:p>
         </w:tc>
@@ -13883,7 +13883,7 @@
                 <w:color w:val="0F172A"/>
                 <w:sz w:val="17"/>
               </w:rPr>
-              <w:t>ARS 1.236,00 (Caso Oficial)</w:t>
+              <w:t>ARS 1.236,00 (Caso Base)</w:t>
             </w:r>
           </w:p>
         </w:tc>
@@ -13950,7 +13950,7 @@
           <w:color w:val="1E3A8A"/>
           <w:sz w:val="22"/>
         </w:rPr>
-        <w:t>12.1 Sensibilidad Cruzada WACC vs. Tasa de Crecimiento Terminal (g)</w:t>
+        <w:t>12.1 Sensibilidad Cruzada: WACC vs. Tasa de Crecimiento Terminal (g)</w:t>
       </w:r>
     </w:p>
     <w:p>
@@ -13963,7 +13963,7 @@
           <w:color w:val="0F172A"/>
           <w:sz w:val="19"/>
         </w:rPr>
-        <w:t>La matriz bidimensional demuestra que el dictamen COMPRAR se sostiene para cualquier WACC inferior a 8,0% en combinación con tasas de crecimiento terminal g ≥ 1,5%.</w:t>
+        <w:t>La matriz bidimensional confirma que la recomendación COMPRAR se mantiene válida para cualquier tasa WACC inferior a 8,0% con tasas de crecimiento terminal g ≥ 1,5%.</w:t>
       </w:r>
     </w:p>
     <w:tbl>
@@ -14103,7 +14103,7 @@
                 <w:color w:val="4A4A4A"/>
                 <w:sz w:val="16"/>
               </w:rPr>
-              <w:t>Figura 19: Mapa de Calor WACC vs. g: Matriz de sensibilidad bidimensional del precio por acción en ARS.</w:t>
+              <w:t>Figura 19: Matriz WACC vs. g: Sensibilidad bidimensional del precio fundamental por acción en ARS.</w:t>
             </w:r>
           </w:p>
         </w:tc>
@@ -14128,7 +14128,7 @@
                 <w:color w:val="4A4A4A"/>
                 <w:sz w:val="16"/>
               </w:rPr>
-              <w:t>Figura 20: Simulación Monte Carlo (20.000 iteraciones): Densidad empírica con innovaciones t-Student (ν=4,2).</w:t>
+              <w:t>Figura 20: Simulación Monte Carlo (20.000 iteraciones): Distribución empírica con innovaciones t-Student (ν=4,2).</w:t>
             </w:r>
           </w:p>
         </w:tc>
@@ -14151,7 +14151,7 @@
           <w:color w:val="0D233A"/>
           <w:sz w:val="18"/>
         </w:rPr>
-        <w:t>Tabla: Síntesis de Precios Intrínsecos por Metodología (ARS/acción)</w:t>
+        <w:t>Tabla: Resumen de Precios Intrínsecos según Metodología (ARS/acción)</w:t>
       </w:r>
     </w:p>
     <w:tbl>
@@ -14312,7 +14312,7 @@
                 <w:color w:val="0F172A"/>
                 <w:sz w:val="17"/>
               </w:rPr>
-              <w:t>DCF λ=1,0 (Riesgo País Completo)</w:t>
+              <w:t>DCF λ=1,0 (Sin Cobertura de Riesgo País)</w:t>
             </w:r>
           </w:p>
         </w:tc>
@@ -14415,11 +14415,435 @@
             <w:r>
               <w:rPr>
                 <w:rFonts w:ascii="Georgia" w:hAnsi="Georgia"/>
+                <w:color w:val="0F172A"/>
+                <w:sz w:val="17"/>
+              </w:rPr>
+              <w:t>DCF con Tasa de Reinversión Damodaran</w:t>
+            </w:r>
+          </w:p>
+        </w:tc>
+        <w:tc>
+          <w:tcPr>
+            <w:tcW w:type="dxa" w:w="1584"/>
+            <w:tcMar>
+              <w:top w:w="60" w:type="dxa"/>
+              <w:bottom w:w="60" w:type="dxa"/>
+              <w:left w:w="100" w:type="dxa"/>
+              <w:right w:w="100" w:type="dxa"/>
+            </w:tcMar>
+          </w:tcPr>
+          <w:p>
+            <w:pPr>
+              <w:spacing w:before="40" w:after="40"/>
+              <w:jc w:val="right"/>
+            </w:pPr>
+            <w:r/>
+            <w:r>
+              <w:rPr>
+                <w:rFonts w:ascii="Georgia" w:hAnsi="Georgia"/>
+                <w:color w:val="0F172A"/>
+                <w:sz w:val="17"/>
+              </w:rPr>
+              <w:t>--</w:t>
+            </w:r>
+          </w:p>
+        </w:tc>
+        <w:tc>
+          <w:tcPr>
+            <w:tcW w:type="dxa" w:w="1728"/>
+            <w:tcMar>
+              <w:top w:w="60" w:type="dxa"/>
+              <w:bottom w:w="60" w:type="dxa"/>
+              <w:left w:w="100" w:type="dxa"/>
+              <w:right w:w="100" w:type="dxa"/>
+            </w:tcMar>
+          </w:tcPr>
+          <w:p>
+            <w:pPr>
+              <w:spacing w:before="40" w:after="40"/>
+              <w:jc w:val="right"/>
+            </w:pPr>
+            <w:r/>
+            <w:r>
+              <w:rPr>
+                <w:rFonts w:ascii="Georgia" w:hAnsi="Georgia"/>
+                <w:color w:val="0F172A"/>
+                <w:sz w:val="17"/>
+              </w:rPr>
+              <w:t>993</w:t>
+            </w:r>
+          </w:p>
+        </w:tc>
+        <w:tc>
+          <w:tcPr>
+            <w:tcW w:type="dxa" w:w="1584"/>
+            <w:tcMar>
+              <w:top w:w="60" w:type="dxa"/>
+              <w:bottom w:w="60" w:type="dxa"/>
+              <w:left w:w="100" w:type="dxa"/>
+              <w:right w:w="100" w:type="dxa"/>
+            </w:tcMar>
+          </w:tcPr>
+          <w:p>
+            <w:pPr>
+              <w:spacing w:before="40" w:after="40"/>
+              <w:jc w:val="right"/>
+            </w:pPr>
+            <w:r/>
+            <w:r>
+              <w:rPr>
+                <w:rFonts w:ascii="Georgia" w:hAnsi="Georgia"/>
+                <w:color w:val="0F172A"/>
+                <w:sz w:val="17"/>
+              </w:rPr>
+              <w:t>--</w:t>
+            </w:r>
+          </w:p>
+        </w:tc>
+      </w:tr>
+      <w:tr>
+        <w:tc>
+          <w:tcPr>
+            <w:tcW w:type="dxa" w:w="5040"/>
+            <w:tcMar>
+              <w:top w:w="60" w:type="dxa"/>
+              <w:bottom w:w="60" w:type="dxa"/>
+              <w:left w:w="100" w:type="dxa"/>
+              <w:right w:w="100" w:type="dxa"/>
+            </w:tcMar>
+          </w:tcPr>
+          <w:p>
+            <w:pPr>
+              <w:spacing w:before="40" w:after="40"/>
+              <w:jc w:val="left"/>
+            </w:pPr>
+            <w:r/>
+            <w:r>
+              <w:rPr>
+                <w:rFonts w:ascii="Georgia" w:hAnsi="Georgia"/>
+                <w:color w:val="0F172A"/>
+                <w:sz w:val="17"/>
+              </w:rPr>
+              <w:t>DCF Caso Base Oficial (Dumrauf, λ=0,20)</w:t>
+            </w:r>
+          </w:p>
+        </w:tc>
+        <w:tc>
+          <w:tcPr>
+            <w:tcW w:type="dxa" w:w="1584"/>
+            <w:tcMar>
+              <w:top w:w="60" w:type="dxa"/>
+              <w:bottom w:w="60" w:type="dxa"/>
+              <w:left w:w="100" w:type="dxa"/>
+              <w:right w:w="100" w:type="dxa"/>
+            </w:tcMar>
+          </w:tcPr>
+          <w:p>
+            <w:pPr>
+              <w:spacing w:before="40" w:after="40"/>
+              <w:jc w:val="right"/>
+            </w:pPr>
+            <w:r/>
+            <w:r>
+              <w:rPr>
+                <w:rFonts w:ascii="Georgia" w:hAnsi="Georgia"/>
+                <w:color w:val="0F172A"/>
+                <w:sz w:val="17"/>
+              </w:rPr>
+              <w:t>--</w:t>
+            </w:r>
+          </w:p>
+        </w:tc>
+        <w:tc>
+          <w:tcPr>
+            <w:tcW w:type="dxa" w:w="1728"/>
+            <w:tcMar>
+              <w:top w:w="60" w:type="dxa"/>
+              <w:bottom w:w="60" w:type="dxa"/>
+              <w:left w:w="100" w:type="dxa"/>
+              <w:right w:w="100" w:type="dxa"/>
+            </w:tcMar>
+          </w:tcPr>
+          <w:p>
+            <w:pPr>
+              <w:spacing w:before="40" w:after="40"/>
+              <w:jc w:val="right"/>
+            </w:pPr>
+            <w:r/>
+            <w:r>
+              <w:rPr>
+                <w:rFonts w:ascii="Georgia" w:hAnsi="Georgia"/>
+                <w:color w:val="0F172A"/>
+                <w:sz w:val="17"/>
+              </w:rPr>
+              <w:t>1.236</w:t>
+            </w:r>
+          </w:p>
+        </w:tc>
+        <w:tc>
+          <w:tcPr>
+            <w:tcW w:type="dxa" w:w="1584"/>
+            <w:tcMar>
+              <w:top w:w="60" w:type="dxa"/>
+              <w:bottom w:w="60" w:type="dxa"/>
+              <w:left w:w="100" w:type="dxa"/>
+              <w:right w:w="100" w:type="dxa"/>
+            </w:tcMar>
+          </w:tcPr>
+          <w:p>
+            <w:pPr>
+              <w:spacing w:before="40" w:after="40"/>
+              <w:jc w:val="right"/>
+            </w:pPr>
+            <w:r/>
+            <w:r>
+              <w:rPr>
+                <w:rFonts w:ascii="Georgia" w:hAnsi="Georgia"/>
+                <w:color w:val="0F172A"/>
+                <w:sz w:val="17"/>
+              </w:rPr>
+              <w:t>--</w:t>
+            </w:r>
+          </w:p>
+        </w:tc>
+      </w:tr>
+      <w:tr>
+        <w:tc>
+          <w:tcPr>
+            <w:tcW w:type="dxa" w:w="5040"/>
+            <w:tcMar>
+              <w:top w:w="60" w:type="dxa"/>
+              <w:bottom w:w="60" w:type="dxa"/>
+              <w:left w:w="100" w:type="dxa"/>
+              <w:right w:w="100" w:type="dxa"/>
+            </w:tcMar>
+          </w:tcPr>
+          <w:p>
+            <w:pPr>
+              <w:spacing w:before="40" w:after="40"/>
+              <w:jc w:val="left"/>
+            </w:pPr>
+            <w:r/>
+            <w:r>
+              <w:rPr>
+                <w:rFonts w:ascii="Georgia" w:hAnsi="Georgia"/>
+                <w:color w:val="0F172A"/>
+                <w:sz w:val="17"/>
+              </w:rPr>
+              <w:t>DCF Crecimiento Optimista (g=2,5%)</w:t>
+            </w:r>
+          </w:p>
+        </w:tc>
+        <w:tc>
+          <w:tcPr>
+            <w:tcW w:type="dxa" w:w="1584"/>
+            <w:tcMar>
+              <w:top w:w="60" w:type="dxa"/>
+              <w:bottom w:w="60" w:type="dxa"/>
+              <w:left w:w="100" w:type="dxa"/>
+              <w:right w:w="100" w:type="dxa"/>
+            </w:tcMar>
+          </w:tcPr>
+          <w:p>
+            <w:pPr>
+              <w:spacing w:before="40" w:after="40"/>
+              <w:jc w:val="right"/>
+            </w:pPr>
+            <w:r/>
+            <w:r>
+              <w:rPr>
+                <w:rFonts w:ascii="Georgia" w:hAnsi="Georgia"/>
+                <w:color w:val="0F172A"/>
+                <w:sz w:val="17"/>
+              </w:rPr>
+              <w:t>--</w:t>
+            </w:r>
+          </w:p>
+        </w:tc>
+        <w:tc>
+          <w:tcPr>
+            <w:tcW w:type="dxa" w:w="1728"/>
+            <w:tcMar>
+              <w:top w:w="60" w:type="dxa"/>
+              <w:bottom w:w="60" w:type="dxa"/>
+              <w:left w:w="100" w:type="dxa"/>
+              <w:right w:w="100" w:type="dxa"/>
+            </w:tcMar>
+          </w:tcPr>
+          <w:p>
+            <w:pPr>
+              <w:spacing w:before="40" w:after="40"/>
+              <w:jc w:val="right"/>
+            </w:pPr>
+            <w:r/>
+            <w:r>
+              <w:rPr>
+                <w:rFonts w:ascii="Georgia" w:hAnsi="Georgia"/>
+                <w:color w:val="0F172A"/>
+                <w:sz w:val="17"/>
+              </w:rPr>
+              <w:t>1.371</w:t>
+            </w:r>
+          </w:p>
+        </w:tc>
+        <w:tc>
+          <w:tcPr>
+            <w:tcW w:type="dxa" w:w="1584"/>
+            <w:tcMar>
+              <w:top w:w="60" w:type="dxa"/>
+              <w:bottom w:w="60" w:type="dxa"/>
+              <w:left w:w="100" w:type="dxa"/>
+              <w:right w:w="100" w:type="dxa"/>
+            </w:tcMar>
+          </w:tcPr>
+          <w:p>
+            <w:pPr>
+              <w:spacing w:before="40" w:after="40"/>
+              <w:jc w:val="right"/>
+            </w:pPr>
+            <w:r/>
+            <w:r>
+              <w:rPr>
+                <w:rFonts w:ascii="Georgia" w:hAnsi="Georgia"/>
+                <w:color w:val="0F172A"/>
+                <w:sz w:val="17"/>
+              </w:rPr>
+              <w:t>--</w:t>
+            </w:r>
+          </w:p>
+        </w:tc>
+      </w:tr>
+      <w:tr>
+        <w:tc>
+          <w:tcPr>
+            <w:tcW w:type="dxa" w:w="5040"/>
+            <w:tcMar>
+              <w:top w:w="60" w:type="dxa"/>
+              <w:bottom w:w="60" w:type="dxa"/>
+              <w:left w:w="100" w:type="dxa"/>
+              <w:right w:w="100" w:type="dxa"/>
+            </w:tcMar>
+          </w:tcPr>
+          <w:p>
+            <w:pPr>
+              <w:spacing w:before="40" w:after="40"/>
+              <w:jc w:val="left"/>
+            </w:pPr>
+            <w:r/>
+            <w:r>
+              <w:rPr>
+                <w:rFonts w:ascii="Georgia" w:hAnsi="Georgia"/>
+                <w:color w:val="0F172A"/>
+                <w:sz w:val="17"/>
+              </w:rPr>
+              <w:t>Monte Carlo (Percentiles P5 / Mediana / P95)</w:t>
+            </w:r>
+          </w:p>
+        </w:tc>
+        <w:tc>
+          <w:tcPr>
+            <w:tcW w:type="dxa" w:w="1584"/>
+            <w:tcMar>
+              <w:top w:w="60" w:type="dxa"/>
+              <w:bottom w:w="60" w:type="dxa"/>
+              <w:left w:w="100" w:type="dxa"/>
+              <w:right w:w="100" w:type="dxa"/>
+            </w:tcMar>
+          </w:tcPr>
+          <w:p>
+            <w:pPr>
+              <w:spacing w:before="40" w:after="40"/>
+              <w:jc w:val="right"/>
+            </w:pPr>
+            <w:r/>
+            <w:r>
+              <w:rPr>
+                <w:rFonts w:ascii="Georgia" w:hAnsi="Georgia"/>
+                <w:color w:val="0F172A"/>
+                <w:sz w:val="17"/>
+              </w:rPr>
+              <w:t>844</w:t>
+            </w:r>
+          </w:p>
+        </w:tc>
+        <w:tc>
+          <w:tcPr>
+            <w:tcW w:type="dxa" w:w="1728"/>
+            <w:tcMar>
+              <w:top w:w="60" w:type="dxa"/>
+              <w:bottom w:w="60" w:type="dxa"/>
+              <w:left w:w="100" w:type="dxa"/>
+              <w:right w:w="100" w:type="dxa"/>
+            </w:tcMar>
+          </w:tcPr>
+          <w:p>
+            <w:pPr>
+              <w:spacing w:before="40" w:after="40"/>
+              <w:jc w:val="right"/>
+            </w:pPr>
+            <w:r/>
+            <w:r>
+              <w:rPr>
+                <w:rFonts w:ascii="Georgia" w:hAnsi="Georgia"/>
+                <w:color w:val="0F172A"/>
+                <w:sz w:val="17"/>
+              </w:rPr>
+              <w:t>1.237</w:t>
+            </w:r>
+          </w:p>
+        </w:tc>
+        <w:tc>
+          <w:tcPr>
+            <w:tcW w:type="dxa" w:w="1584"/>
+            <w:tcMar>
+              <w:top w:w="60" w:type="dxa"/>
+              <w:bottom w:w="60" w:type="dxa"/>
+              <w:left w:w="100" w:type="dxa"/>
+              <w:right w:w="100" w:type="dxa"/>
+            </w:tcMar>
+          </w:tcPr>
+          <w:p>
+            <w:pPr>
+              <w:spacing w:before="40" w:after="40"/>
+              <w:jc w:val="right"/>
+            </w:pPr>
+            <w:r/>
+            <w:r>
+              <w:rPr>
+                <w:rFonts w:ascii="Georgia" w:hAnsi="Georgia"/>
+                <w:color w:val="0F172A"/>
+                <w:sz w:val="17"/>
+              </w:rPr>
+              <w:t>1.737</w:t>
+            </w:r>
+          </w:p>
+        </w:tc>
+      </w:tr>
+      <w:tr>
+        <w:tc>
+          <w:tcPr>
+            <w:tcW w:type="dxa" w:w="5040"/>
+            <w:tcMar>
+              <w:top w:w="60" w:type="dxa"/>
+              <w:bottom w:w="60" w:type="dxa"/>
+              <w:left w:w="100" w:type="dxa"/>
+              <w:right w:w="100" w:type="dxa"/>
+            </w:tcMar>
+          </w:tcPr>
+          <w:p>
+            <w:pPr>
+              <w:spacing w:before="40" w:after="40"/>
+              <w:jc w:val="left"/>
+            </w:pPr>
+            <w:r/>
+            <w:r>
+              <w:rPr>
+                <w:rFonts w:ascii="Georgia" w:hAnsi="Georgia"/>
                 <w:b/>
                 <w:color w:val="0D233A"/>
                 <w:sz w:val="17"/>
               </w:rPr>
-              <w:t>DCF Damodaran (g = ROIC × RR)</w:t>
+              <w:t>Target Integrado (DCF + Opción Real PEAL V)</w:t>
             </w:r>
           </w:p>
         </w:tc>
@@ -14473,7 +14897,7 @@
                 <w:color w:val="0D233A"/>
                 <w:sz w:val="17"/>
               </w:rPr>
-              <w:t>993</w:t>
+              <w:t>1.255,60</w:t>
             </w:r>
           </w:p>
         </w:tc>
@@ -14528,435 +14952,7 @@
                 <w:color w:val="0F172A"/>
                 <w:sz w:val="17"/>
               </w:rPr>
-              <w:t>DCF Caso Base Oficial (Dumrauf, λ=0,20)</w:t>
-            </w:r>
-          </w:p>
-        </w:tc>
-        <w:tc>
-          <w:tcPr>
-            <w:tcW w:type="dxa" w:w="1584"/>
-            <w:tcMar>
-              <w:top w:w="60" w:type="dxa"/>
-              <w:bottom w:w="60" w:type="dxa"/>
-              <w:left w:w="100" w:type="dxa"/>
-              <w:right w:w="100" w:type="dxa"/>
-            </w:tcMar>
-          </w:tcPr>
-          <w:p>
-            <w:pPr>
-              <w:spacing w:before="40" w:after="40"/>
-              <w:jc w:val="right"/>
-            </w:pPr>
-            <w:r/>
-            <w:r>
-              <w:rPr>
-                <w:rFonts w:ascii="Georgia" w:hAnsi="Georgia"/>
-                <w:color w:val="0F172A"/>
-                <w:sz w:val="17"/>
-              </w:rPr>
-              <w:t>--</w:t>
-            </w:r>
-          </w:p>
-        </w:tc>
-        <w:tc>
-          <w:tcPr>
-            <w:tcW w:type="dxa" w:w="1728"/>
-            <w:tcMar>
-              <w:top w:w="60" w:type="dxa"/>
-              <w:bottom w:w="60" w:type="dxa"/>
-              <w:left w:w="100" w:type="dxa"/>
-              <w:right w:w="100" w:type="dxa"/>
-            </w:tcMar>
-          </w:tcPr>
-          <w:p>
-            <w:pPr>
-              <w:spacing w:before="40" w:after="40"/>
-              <w:jc w:val="right"/>
-            </w:pPr>
-            <w:r/>
-            <w:r>
-              <w:rPr>
-                <w:rFonts w:ascii="Georgia" w:hAnsi="Georgia"/>
-                <w:color w:val="0F172A"/>
-                <w:sz w:val="17"/>
-              </w:rPr>
-              <w:t>1.236</w:t>
-            </w:r>
-          </w:p>
-        </w:tc>
-        <w:tc>
-          <w:tcPr>
-            <w:tcW w:type="dxa" w:w="1584"/>
-            <w:tcMar>
-              <w:top w:w="60" w:type="dxa"/>
-              <w:bottom w:w="60" w:type="dxa"/>
-              <w:left w:w="100" w:type="dxa"/>
-              <w:right w:w="100" w:type="dxa"/>
-            </w:tcMar>
-          </w:tcPr>
-          <w:p>
-            <w:pPr>
-              <w:spacing w:before="40" w:after="40"/>
-              <w:jc w:val="right"/>
-            </w:pPr>
-            <w:r/>
-            <w:r>
-              <w:rPr>
-                <w:rFonts w:ascii="Georgia" w:hAnsi="Georgia"/>
-                <w:color w:val="0F172A"/>
-                <w:sz w:val="17"/>
-              </w:rPr>
-              <w:t>--</w:t>
-            </w:r>
-          </w:p>
-        </w:tc>
-      </w:tr>
-      <w:tr>
-        <w:tc>
-          <w:tcPr>
-            <w:tcW w:type="dxa" w:w="5040"/>
-            <w:tcMar>
-              <w:top w:w="60" w:type="dxa"/>
-              <w:bottom w:w="60" w:type="dxa"/>
-              <w:left w:w="100" w:type="dxa"/>
-              <w:right w:w="100" w:type="dxa"/>
-            </w:tcMar>
-          </w:tcPr>
-          <w:p>
-            <w:pPr>
-              <w:spacing w:before="40" w:after="40"/>
-              <w:jc w:val="left"/>
-            </w:pPr>
-            <w:r/>
-            <w:r>
-              <w:rPr>
-                <w:rFonts w:ascii="Georgia" w:hAnsi="Georgia"/>
-                <w:color w:val="0F172A"/>
-                <w:sz w:val="17"/>
-              </w:rPr>
-              <w:t>DCF Crecimiento Optimista (g=2,5%)</w:t>
-            </w:r>
-          </w:p>
-        </w:tc>
-        <w:tc>
-          <w:tcPr>
-            <w:tcW w:type="dxa" w:w="1584"/>
-            <w:tcMar>
-              <w:top w:w="60" w:type="dxa"/>
-              <w:bottom w:w="60" w:type="dxa"/>
-              <w:left w:w="100" w:type="dxa"/>
-              <w:right w:w="100" w:type="dxa"/>
-            </w:tcMar>
-          </w:tcPr>
-          <w:p>
-            <w:pPr>
-              <w:spacing w:before="40" w:after="40"/>
-              <w:jc w:val="right"/>
-            </w:pPr>
-            <w:r/>
-            <w:r>
-              <w:rPr>
-                <w:rFonts w:ascii="Georgia" w:hAnsi="Georgia"/>
-                <w:color w:val="0F172A"/>
-                <w:sz w:val="17"/>
-              </w:rPr>
-              <w:t>--</w:t>
-            </w:r>
-          </w:p>
-        </w:tc>
-        <w:tc>
-          <w:tcPr>
-            <w:tcW w:type="dxa" w:w="1728"/>
-            <w:tcMar>
-              <w:top w:w="60" w:type="dxa"/>
-              <w:bottom w:w="60" w:type="dxa"/>
-              <w:left w:w="100" w:type="dxa"/>
-              <w:right w:w="100" w:type="dxa"/>
-            </w:tcMar>
-          </w:tcPr>
-          <w:p>
-            <w:pPr>
-              <w:spacing w:before="40" w:after="40"/>
-              <w:jc w:val="right"/>
-            </w:pPr>
-            <w:r/>
-            <w:r>
-              <w:rPr>
-                <w:rFonts w:ascii="Georgia" w:hAnsi="Georgia"/>
-                <w:color w:val="0F172A"/>
-                <w:sz w:val="17"/>
-              </w:rPr>
-              <w:t>1.371</w:t>
-            </w:r>
-          </w:p>
-        </w:tc>
-        <w:tc>
-          <w:tcPr>
-            <w:tcW w:type="dxa" w:w="1584"/>
-            <w:tcMar>
-              <w:top w:w="60" w:type="dxa"/>
-              <w:bottom w:w="60" w:type="dxa"/>
-              <w:left w:w="100" w:type="dxa"/>
-              <w:right w:w="100" w:type="dxa"/>
-            </w:tcMar>
-          </w:tcPr>
-          <w:p>
-            <w:pPr>
-              <w:spacing w:before="40" w:after="40"/>
-              <w:jc w:val="right"/>
-            </w:pPr>
-            <w:r/>
-            <w:r>
-              <w:rPr>
-                <w:rFonts w:ascii="Georgia" w:hAnsi="Georgia"/>
-                <w:color w:val="0F172A"/>
-                <w:sz w:val="17"/>
-              </w:rPr>
-              <w:t>--</w:t>
-            </w:r>
-          </w:p>
-        </w:tc>
-      </w:tr>
-      <w:tr>
-        <w:tc>
-          <w:tcPr>
-            <w:tcW w:type="dxa" w:w="5040"/>
-            <w:tcMar>
-              <w:top w:w="60" w:type="dxa"/>
-              <w:bottom w:w="60" w:type="dxa"/>
-              <w:left w:w="100" w:type="dxa"/>
-              <w:right w:w="100" w:type="dxa"/>
-            </w:tcMar>
-          </w:tcPr>
-          <w:p>
-            <w:pPr>
-              <w:spacing w:before="40" w:after="40"/>
-              <w:jc w:val="left"/>
-            </w:pPr>
-            <w:r/>
-            <w:r>
-              <w:rPr>
-                <w:rFonts w:ascii="Georgia" w:hAnsi="Georgia"/>
-                <w:color w:val="0F172A"/>
-                <w:sz w:val="17"/>
-              </w:rPr>
-              <w:t>Monte Carlo (Percentiles P5 / Mediana / P95)</w:t>
-            </w:r>
-          </w:p>
-        </w:tc>
-        <w:tc>
-          <w:tcPr>
-            <w:tcW w:type="dxa" w:w="1584"/>
-            <w:tcMar>
-              <w:top w:w="60" w:type="dxa"/>
-              <w:bottom w:w="60" w:type="dxa"/>
-              <w:left w:w="100" w:type="dxa"/>
-              <w:right w:w="100" w:type="dxa"/>
-            </w:tcMar>
-          </w:tcPr>
-          <w:p>
-            <w:pPr>
-              <w:spacing w:before="40" w:after="40"/>
-              <w:jc w:val="right"/>
-            </w:pPr>
-            <w:r/>
-            <w:r>
-              <w:rPr>
-                <w:rFonts w:ascii="Georgia" w:hAnsi="Georgia"/>
-                <w:color w:val="0F172A"/>
-                <w:sz w:val="17"/>
-              </w:rPr>
-              <w:t>844</w:t>
-            </w:r>
-          </w:p>
-        </w:tc>
-        <w:tc>
-          <w:tcPr>
-            <w:tcW w:type="dxa" w:w="1728"/>
-            <w:tcMar>
-              <w:top w:w="60" w:type="dxa"/>
-              <w:bottom w:w="60" w:type="dxa"/>
-              <w:left w:w="100" w:type="dxa"/>
-              <w:right w:w="100" w:type="dxa"/>
-            </w:tcMar>
-          </w:tcPr>
-          <w:p>
-            <w:pPr>
-              <w:spacing w:before="40" w:after="40"/>
-              <w:jc w:val="right"/>
-            </w:pPr>
-            <w:r/>
-            <w:r>
-              <w:rPr>
-                <w:rFonts w:ascii="Georgia" w:hAnsi="Georgia"/>
-                <w:color w:val="0F172A"/>
-                <w:sz w:val="17"/>
-              </w:rPr>
-              <w:t>1.237</w:t>
-            </w:r>
-          </w:p>
-        </w:tc>
-        <w:tc>
-          <w:tcPr>
-            <w:tcW w:type="dxa" w:w="1584"/>
-            <w:tcMar>
-              <w:top w:w="60" w:type="dxa"/>
-              <w:bottom w:w="60" w:type="dxa"/>
-              <w:left w:w="100" w:type="dxa"/>
-              <w:right w:w="100" w:type="dxa"/>
-            </w:tcMar>
-          </w:tcPr>
-          <w:p>
-            <w:pPr>
-              <w:spacing w:before="40" w:after="40"/>
-              <w:jc w:val="right"/>
-            </w:pPr>
-            <w:r/>
-            <w:r>
-              <w:rPr>
-                <w:rFonts w:ascii="Georgia" w:hAnsi="Georgia"/>
-                <w:color w:val="0F172A"/>
-                <w:sz w:val="17"/>
-              </w:rPr>
-              <w:t>1.737</w:t>
-            </w:r>
-          </w:p>
-        </w:tc>
-      </w:tr>
-      <w:tr>
-        <w:tc>
-          <w:tcPr>
-            <w:tcW w:type="dxa" w:w="5040"/>
-            <w:tcMar>
-              <w:top w:w="60" w:type="dxa"/>
-              <w:bottom w:w="60" w:type="dxa"/>
-              <w:left w:w="100" w:type="dxa"/>
-              <w:right w:w="100" w:type="dxa"/>
-            </w:tcMar>
-          </w:tcPr>
-          <w:p>
-            <w:pPr>
-              <w:spacing w:before="40" w:after="40"/>
-              <w:jc w:val="left"/>
-            </w:pPr>
-            <w:r/>
-            <w:r>
-              <w:rPr>
-                <w:rFonts w:ascii="Georgia" w:hAnsi="Georgia"/>
-                <w:b/>
-                <w:color w:val="0D233A"/>
-                <w:sz w:val="17"/>
-              </w:rPr>
-              <w:t>Target Integrado (DCF + Opción Real PEAL V)</w:t>
-            </w:r>
-          </w:p>
-        </w:tc>
-        <w:tc>
-          <w:tcPr>
-            <w:tcW w:type="dxa" w:w="1584"/>
-            <w:tcMar>
-              <w:top w:w="60" w:type="dxa"/>
-              <w:bottom w:w="60" w:type="dxa"/>
-              <w:left w:w="100" w:type="dxa"/>
-              <w:right w:w="100" w:type="dxa"/>
-            </w:tcMar>
-          </w:tcPr>
-          <w:p>
-            <w:pPr>
-              <w:spacing w:before="40" w:after="40"/>
-              <w:jc w:val="right"/>
-            </w:pPr>
-            <w:r/>
-            <w:r>
-              <w:rPr>
-                <w:rFonts w:ascii="Georgia" w:hAnsi="Georgia"/>
-                <w:b/>
-                <w:color w:val="0D233A"/>
-                <w:sz w:val="17"/>
-              </w:rPr>
-              <w:t>--</w:t>
-            </w:r>
-          </w:p>
-        </w:tc>
-        <w:tc>
-          <w:tcPr>
-            <w:tcW w:type="dxa" w:w="1728"/>
-            <w:tcMar>
-              <w:top w:w="60" w:type="dxa"/>
-              <w:bottom w:w="60" w:type="dxa"/>
-              <w:left w:w="100" w:type="dxa"/>
-              <w:right w:w="100" w:type="dxa"/>
-            </w:tcMar>
-          </w:tcPr>
-          <w:p>
-            <w:pPr>
-              <w:spacing w:before="40" w:after="40"/>
-              <w:jc w:val="right"/>
-            </w:pPr>
-            <w:r/>
-            <w:r>
-              <w:rPr>
-                <w:rFonts w:ascii="Georgia" w:hAnsi="Georgia"/>
-                <w:b/>
-                <w:color w:val="0D233A"/>
-                <w:sz w:val="17"/>
-              </w:rPr>
-              <w:t>1.255,60</w:t>
-            </w:r>
-          </w:p>
-        </w:tc>
-        <w:tc>
-          <w:tcPr>
-            <w:tcW w:type="dxa" w:w="1584"/>
-            <w:tcMar>
-              <w:top w:w="60" w:type="dxa"/>
-              <w:bottom w:w="60" w:type="dxa"/>
-              <w:left w:w="100" w:type="dxa"/>
-              <w:right w:w="100" w:type="dxa"/>
-            </w:tcMar>
-          </w:tcPr>
-          <w:p>
-            <w:pPr>
-              <w:spacing w:before="40" w:after="40"/>
-              <w:jc w:val="right"/>
-            </w:pPr>
-            <w:r/>
-            <w:r>
-              <w:rPr>
-                <w:rFonts w:ascii="Georgia" w:hAnsi="Georgia"/>
-                <w:b/>
-                <w:color w:val="0D233A"/>
-                <w:sz w:val="17"/>
-              </w:rPr>
-              <w:t>--</w:t>
-            </w:r>
-          </w:p>
-        </w:tc>
-      </w:tr>
-      <w:tr>
-        <w:tc>
-          <w:tcPr>
-            <w:tcW w:type="dxa" w:w="5040"/>
-            <w:tcMar>
-              <w:top w:w="60" w:type="dxa"/>
-              <w:bottom w:w="60" w:type="dxa"/>
-              <w:left w:w="100" w:type="dxa"/>
-              <w:right w:w="100" w:type="dxa"/>
-            </w:tcMar>
-          </w:tcPr>
-          <w:p>
-            <w:pPr>
-              <w:spacing w:before="40" w:after="40"/>
-              <w:jc w:val="left"/>
-            </w:pPr>
-            <w:r/>
-            <w:r>
-              <w:rPr>
-                <w:rFonts w:ascii="Georgia" w:hAnsi="Georgia"/>
-                <w:color w:val="0F172A"/>
-                <w:sz w:val="17"/>
-              </w:rPr>
-              <w:t>Marco de Escenarios Ponderado (25/50/25)</w:t>
+              <w:t>Escenarios Ponderados (25/50/25)</w:t>
             </w:r>
           </w:p>
         </w:tc>
@@ -15218,7 +15214,7 @@
           <w:color w:val="0F172A"/>
           <w:sz w:val="19"/>
         </w:rPr>
-        <w:t>La simulación de Monte Carlo con 20.000 iteraciones e innovaciones con colas pesadas t-Student arroja una mediana de ARS 1.237 y un intervalo de confianza P5–P95 de ARS 844 a ARS 1.737, con un 85,2% de probabilidad empírica de retorno positivo frente al spot.</w:t>
+        <w:t>La simulación de Monte Carlo con 20.000 iteraciones e innovaciones con colas pesadas t-Student arroja una mediana de ARS 1.237 y un intervalo de confianza P5–P95 de ARS 844 a ARS 1.737, con un 85,2% de probabilidad empírica de retorno positivo frente a la cotización spot.</w:t>
       </w:r>
     </w:p>
     <w:p>
@@ -15233,7 +15229,7 @@
           <w:color w:val="1E3A8A"/>
           <w:sz w:val="22"/>
         </w:rPr>
-        <w:t>13.2 Análisis de Expectativas Implícitas: Tasa Implícita del DCF Inverso (g* = 0,69%)</w:t>
+        <w:t>13.2 Expectativas Implícitas: Tasa de Crecimiento del DCF Inverso (g* = 0,69%)</w:t>
       </w:r>
     </w:p>
     <w:p>
@@ -15246,7 +15242,7 @@
           <w:color w:val="0F172A"/>
           <w:sz w:val="19"/>
         </w:rPr>
-        <w:t>Despejando la tasa de crecimiento terminal implícita en la cotización de mercado, se comprueba que el precio actual descuenta un crecimiento a perpetuidad de apenas g* = 0,69%, muy por debajo del 2,0% fundamental.</w:t>
+        <w:t>Despejando la tasa de crecimiento terminal implícita en la cotización de mercado, se comprueba que el precio actual descuenta un crecimiento a perpetuidad de apenas g* = 0,69%, muy por debajo del 2,0% fundamental de largo plazo.</w:t>
       </w:r>
     </w:p>
     <w:tbl>
@@ -15386,7 +15382,7 @@
                 <w:color w:val="4A4A4A"/>
                 <w:sz w:val="16"/>
               </w:rPr>
-              <w:t>Figura 21: DCF Inverso: Tasa g implícita descontada en el precio spot de mercado (0,69%).</w:t>
+              <w:t>Figura 21: DCF Inverso: Tasa g implícita descontada en el precio de mercado (0,69%).</w:t>
             </w:r>
           </w:p>
         </w:tc>
@@ -15450,7 +15446,7 @@
           <w:color w:val="0F172A"/>
           <w:sz w:val="19"/>
         </w:rPr>
-        <w:t>El análisis de múltiplos sectoriales confirma la divergencia entre la valuación LTM y la capacidad de generación normalizada. Mientras el múltiplo LTM de Aluar (13,3x) se encuentra transitoriamente afectado por el ciclo de FY2025, su rendimiento del flujo libre de caja proyectado (FCF Yield 2027E &gt; 10%) supera con holgura la mediana internacional (3,8%):</w:t>
+        <w:t>El análisis comparativo sectorial confirma la divergencia entre la valuación basada en cifras LTM y la capacidad de generación normalizada. Mientras el múltiplo LTM de Aluar (13,3x) refleja la compresión de resultados de FY2025, el rendimiento proyectado del flujo libre de caja (FCF Yield 2027E &gt; 10%) supera ampliamente la mediana de la industria internacional (3,8%):</w:t>
       </w:r>
     </w:p>
     <w:p>
@@ -15465,7 +15461,7 @@
           <w:color w:val="0D233A"/>
           <w:sz w:val="18"/>
         </w:rPr>
-        <w:t>Tabla: Tabla Comparativa Sectorial y Múltiplos Financieros LTM (julio-2026)</w:t>
+        <w:t>Tabla: Múltiplos Financieros y Rendimientos del Sector Aluminio (julio-2026)</w:t>
       </w:r>
     </w:p>
     <w:tbl>
@@ -15572,7 +15568,7 @@
                 <w:color w:val="0D233A"/>
                 <w:sz w:val="17"/>
               </w:rPr>
-              <w:t>Crec. Ingresos LTM</w:t>
+              <w:t>Crec. Ventas LTM</w:t>
             </w:r>
           </w:p>
         </w:tc>
@@ -16790,7 +16786,7 @@
                 <w:color w:val="0F172A"/>
                 <w:sz w:val="17"/>
               </w:rPr>
-              <w:t>Mediana Sectorial</w:t>
+              <w:t>Mediana de la Industria</w:t>
             </w:r>
           </w:p>
         </w:tc>
@@ -16946,7 +16942,7 @@
           <w:color w:val="0D233A"/>
           <w:sz w:val="26"/>
         </w:rPr>
-        <w:t>15. Gestión Cuantitativa de Riesgo y Asignación de Portafolio</w:t>
+        <w:t>15. Gestión de Riesgos de Mercado y Asignación Óptima de Cartera</w:t>
       </w:r>
     </w:p>
     <w:p>
@@ -16998,7 +16994,7 @@
           <w:color w:val="0F172A"/>
           <w:sz w:val="19"/>
         </w:rPr>
-        <w:t>Para carteras institucionales se impone un límite de política de riesgo del 20,0%, restringido por el Conditional Value-at-Risk mensual al 95% (-32,80%). El Filtro de Kalman dinámico muestra que el Beta reciente converge a 0,764:</w:t>
+        <w:t>Para la gestión prudencial de carteras se adopta un límite de exposición del 20,0%, acotado por el Conditional Value-at-Risk mensual al 95% (-32,80%). El Filtro de Kalman dinámico indica que el Beta de corto plazo converge a 0,764:</w:t>
       </w:r>
     </w:p>
     <w:p>
@@ -17023,6 +17019,19 @@
           <w:sz w:val="18"/>
         </w:rPr>
         <w:t xml:space="preserve">    (Filtro de Kalman)</w:t>
+      </w:r>
+    </w:p>
+    <w:p>
+      <w:pPr>
+        <w:spacing w:before="0" w:after="60" w:line="276" w:lineRule="auto"/>
+      </w:pPr>
+      <w:r>
+        <w:rPr>
+          <w:rFonts w:ascii="Georgia" w:hAnsi="Georgia"/>
+          <w:color w:val="0F172A"/>
+          <w:sz w:val="19"/>
+        </w:rPr>
+        <w:t>Esto demuestra que el beta Hamada de 0,888 utilizado en el WACC introduce un margen de seguridad conservador.</w:t>
       </w:r>
     </w:p>
     <w:tbl>
@@ -17162,7 +17171,7 @@
                 <w:color w:val="4A4A4A"/>
                 <w:sz w:val="16"/>
               </w:rPr>
-              <w:t>Figura 23: Criterio de Asignación de Kelly: Full-Kelly (73,5%), Half-Kelly (36,8%) y Límite de Riesgo (20,0%).</w:t>
+              <w:t>Figura 23: Criterio de Asignación de Kelly: Full-Kelly (73,5%), Half-Kelly (36,8%) y Límite de Cartera (20,0%).</w:t>
             </w:r>
           </w:p>
         </w:tc>
@@ -17187,7 +17196,7 @@
                 <w:color w:val="4A4A4A"/>
                 <w:sz w:val="16"/>
               </w:rPr>
-              <w:t>Figura 24: Beta Dinámico por Filtro de Kalman: Convergencia a 0,764 en el régimen de riesgo reciente.</w:t>
+              <w:t>Figura 24: Beta Dinámico por Filtro de Kalman: Convergencia a 0,764 en el régimen macroeconómico reciente.</w:t>
             </w:r>
           </w:p>
         </w:tc>
@@ -17210,7 +17219,7 @@
           <w:color w:val="1E3A8A"/>
           <w:sz w:val="22"/>
         </w:rPr>
-        <w:t>15.2 Comportamiento Histórico de ALUA.BA en Ventanas de Crisis</w:t>
+        <w:t>15.2 Comportamiento Histórico de ALUA.BA en Períodos de Estrés</w:t>
       </w:r>
     </w:p>
     <w:p>
@@ -17225,7 +17234,7 @@
           <w:color w:val="0D233A"/>
           <w:sz w:val="18"/>
         </w:rPr>
-        <w:t>Tabla: Comportamiento Histórico de ALUA.BA (USD) en Ventanas de Crisis</w:t>
+        <w:t>Tabla: Desempeño Histórico de ALUA.BA (en USD) durante Episodios de Crisis</w:t>
       </w:r>
     </w:p>
     <w:tbl>
@@ -17359,7 +17368,7 @@
                 <w:color w:val="0D233A"/>
                 <w:sz w:val="17"/>
               </w:rPr>
-              <w:t>Observaciones</w:t>
+              <w:t>Duración</w:t>
             </w:r>
           </w:p>
         </w:tc>
@@ -17519,7 +17528,7 @@
                 <w:color w:val="0F172A"/>
                 <w:sz w:val="17"/>
               </w:rPr>
-              <w:t>Shock global de liquidez</w:t>
+              <w:t>Shock de liquidez global</w:t>
             </w:r>
           </w:p>
         </w:tc>
@@ -17547,7 +17556,7 @@
                 <w:color w:val="0F172A"/>
                 <w:sz w:val="17"/>
               </w:rPr>
-              <w:t>Volatilidad Cambiaria (Julio 2022)</w:t>
+              <w:t>Tensión Cambiaria (Julio 2022)</w:t>
             </w:r>
           </w:p>
         </w:tc>
@@ -17651,7 +17660,7 @@
                 <w:color w:val="0F172A"/>
                 <w:sz w:val="17"/>
               </w:rPr>
-              <w:t>Cobertura dolarizada</w:t>
+              <w:t>Cobertura en activos dolarizados</w:t>
             </w:r>
           </w:p>
         </w:tc>
@@ -17679,7 +17688,7 @@
                 <w:color w:val="0F172A"/>
                 <w:sz w:val="17"/>
               </w:rPr>
-              <w:t>Post-Elecciones 2023</w:t>
+              <w:t>Incertidumbre Electoral 2023</w:t>
             </w:r>
           </w:p>
         </w:tc>
@@ -17783,7 +17792,7 @@
                 <w:color w:val="0F172A"/>
                 <w:sz w:val="17"/>
               </w:rPr>
-              <w:t>Revaluación de activos reales</w:t>
+              <w:t>Repreciación de capacidad industrial</w:t>
             </w:r>
           </w:p>
         </w:tc>
@@ -17811,7 +17820,7 @@
                 <w:color w:val="0F172A"/>
                 <w:sz w:val="17"/>
               </w:rPr>
-              <w:t>Shock LME Post-Pico (2022–2023)</w:t>
+              <w:t>Corrección LME (2022–2023)</w:t>
             </w:r>
           </w:p>
         </w:tc>
@@ -17915,7 +17924,7 @@
                 <w:color w:val="0F172A"/>
                 <w:sz w:val="17"/>
               </w:rPr>
-              <w:t>Resiliencia por costos bajos</w:t>
+              <w:t>Resiliencia por bajos costos operativos</w:t>
             </w:r>
           </w:p>
         </w:tc>
@@ -17938,7 +17947,7 @@
           <w:color w:val="1E3A8A"/>
           <w:sz w:val="22"/>
         </w:rPr>
-        <w:t>15.3 Evaluación Metodológica de VaR/CVaR y Modelado de Colas (EVT-GPD)</w:t>
+        <w:t>15.3 Estimación de Pérdidas Extremas por Teoría de Valores Extremos (EVT-GPD)</w:t>
       </w:r>
     </w:p>
     <w:p>
@@ -17951,7 +17960,7 @@
           <w:color w:val="0F172A"/>
           <w:sz w:val="19"/>
         </w:rPr>
-        <w:t>La expansión de Cornish-Fisher subestima el riesgo extremo en la cola del 99% (-13,41%). Por ello se adopta la Teoría de Valores Extremos (EVT) con ajuste Pareto Generalizado (GPD, ξ = 0,214 &gt; 0), capturando la leptocurtosis y colas pesadas de tipo Fréchet:</w:t>
+        <w:t>Dado que los retornos de Aluar presentan colas pesadas (curtosis = 7,82), la aproximación normal subestima las pérdidas extremas. Se calibra un modelo Pareto Generalizado (GPD, ξ = 0,214 &gt; 0), capturando pérdidas de cola de tipo Fréchet:</w:t>
       </w:r>
     </w:p>
     <w:p>
@@ -17990,7 +17999,7 @@
           <w:color w:val="0D233A"/>
           <w:sz w:val="18"/>
         </w:rPr>
-        <w:t>Tabla: VaR y CVaR Diario por Metodología (retornos USD, 1 día)</w:t>
+        <w:t>Tabla: VaR y CVaR Diario por Metodología (retornos en USD, horizonte 1 día)</w:t>
       </w:r>
     </w:p>
     <w:tbl>
@@ -18907,7 +18916,7 @@
                 <w:color w:val="4A4A4A"/>
                 <w:sz w:val="16"/>
               </w:rPr>
-              <w:t>Figura 25: Teoría de Valores Extremos (EVT-GPD): Estimación de pérdidas de cola con VaR 99% (8,20%) y ES 99% (10,35%).</w:t>
+              <w:t>Figura 25: Valores Extremos (EVT-GPD): Estimación de pérdidas de cola con VaR 99% (8,20%) y ES 99% (10,35%).</w:t>
             </w:r>
           </w:p>
         </w:tc>
@@ -18932,7 +18941,7 @@
                 <w:color w:val="4A4A4A"/>
                 <w:sz w:val="16"/>
               </w:rPr>
-              <w:t>Figura 26: Simulación LME (OU vs. MBG): Proceso de reversión a la media Ornstein-Uhlenbeck (θ = USD 2.814/t).</w:t>
+              <w:t>Figura 26: Simulación LME (OU vs. MBG): Reversión a la media Ornstein-Uhlenbeck (θ = USD 2.814/t).</w:t>
             </w:r>
           </w:p>
         </w:tc>
@@ -18955,7 +18964,7 @@
           <w:color w:val="1E3A8A"/>
           <w:sz w:val="22"/>
         </w:rPr>
-        <w:t>15.4 Dinámica de Commodities: Ornstein-Uhlenbeck vs. Movimiento Browniano</w:t>
+        <w:t>15.4 Dinámica del Commodity: Proceso Ornstein-Uhlenbeck</w:t>
       </w:r>
     </w:p>
     <w:p>
@@ -19119,7 +19128,7 @@
                 <w:color w:val="4A4A4A"/>
                 <w:sz w:val="16"/>
               </w:rPr>
-              <w:t>Figura 27: DCF Estocástico Continuo: Densidad de probabilidad con 10.000 trayectorias de precios y costos.</w:t>
+              <w:t>Figura 27: DCF Estocástico Continuo: Densidad de probabilidad con 10.000 trayectorias simuladas.</w:t>
             </w:r>
           </w:p>
         </w:tc>
@@ -19144,7 +19153,7 @@
                 <w:color w:val="4A4A4A"/>
                 <w:sz w:val="16"/>
               </w:rPr>
-              <w:t>Figura 28: Matriz Bidimensional de Riesgo: Mapeo según estándar CFA de Probabilidad vs. Impacto.</w:t>
+              <w:t>Figura 28: Matriz de Riesgo: Mapeo de Probabilidad vs. Impacto según estándares de análisis financiero.</w:t>
             </w:r>
           </w:p>
         </w:tc>
@@ -19170,7 +19179,7 @@
           <w:color w:val="0D233A"/>
           <w:sz w:val="26"/>
         </w:rPr>
-        <w:t>16. Modelización Estocástica, Dependencia de Cola y Validación Econométrica</w:t>
+        <w:t>16. Modelización Estocástica Avanzada y Validación Econométrica</w:t>
       </w:r>
     </w:p>
     <w:p>
@@ -19185,7 +19194,7 @@
           <w:color w:val="1E3A8A"/>
           <w:sz w:val="22"/>
         </w:rPr>
-        <w:t>16.1 Validacion de la Curva Soberana: AR(1) vs. Cox-Ingersoll-Ross (CIR)</w:t>
+        <w:t>16.1 Validación de la Tasa de Descuento: AR(1) vs. Cox-Ingersoll-Ross (CIR)</w:t>
       </w:r>
     </w:p>
     <w:p>
@@ -19222,7 +19231,7 @@
           <w:color w:val="0F172A"/>
           <w:sz w:val="19"/>
         </w:rPr>
-        <w:t>Con κ = 0,7582, θ = 0,1614 y σ = 0,085, se verifica 2(0,7582)(0,1614) = 0,2448 &gt; 0,0072 = σ².</w:t>
+        <w:t>Con κ = 0,7582, θ = 0,1614 y σ = 0,085, se verifica 2(0,7582)(0,1614) = 0,2448 &gt; 0,0072 = σ², garantizando que la tasa simulada nunca caiga por debajo de la tasa libre de riesgo de EE.UU.</w:t>
       </w:r>
     </w:p>
     <w:tbl>
@@ -19362,7 +19371,7 @@
                 <w:color w:val="4A4A4A"/>
                 <w:sz w:val="16"/>
               </w:rPr>
-              <w:t>Figura 29: Proceso CIR Soberano: Simulación estocástica del EMBI+ respetando la no-negatividad estricta.</w:t>
+              <w:t>Figura 29: Proceso CIR Soberano: Simulación del EMBI+ respetando la no-negatividad estricta.</w:t>
             </w:r>
           </w:p>
         </w:tc>
@@ -19387,7 +19396,7 @@
                 <w:color w:val="4A4A4A"/>
                 <w:sz w:val="16"/>
               </w:rPr>
-              <w:t>Figura 30: Beta Condicional GARCH(1,1): Variación temporal de la volatilidad condicional y riesgo sistemático.</w:t>
+              <w:t>Figura 30: Beta Condicional GARCH(1,1): Variación temporal de la volatilidad y riesgo sistemático.</w:t>
             </w:r>
           </w:p>
         </w:tc>
@@ -19574,7 +19583,7 @@
                 <w:color w:val="4A4A4A"/>
                 <w:sz w:val="16"/>
               </w:rPr>
-              <w:t>Figura 31: Cópula de Clayton Asimétrica: Modelado de co-caídas extremas entre el activo y el mercado (λ_L = 0,38).</w:t>
+              <w:t>Figura 31: Cópula de Clayton Asimétrica: Modelado de co-caídas entre el activo y el mercado (λ_L = 0,38).</w:t>
             </w:r>
           </w:p>
         </w:tc>
@@ -19622,7 +19631,7 @@
           <w:color w:val="1E3A8A"/>
           <w:sz w:val="22"/>
         </w:rPr>
-        <w:t>16.3 Matriz de Diagnóstico Econométrico y Pruebas Estadísticas</w:t>
+        <w:t>16.3 Diagnóstico Econométrico y Pruebas Estadísticas</w:t>
       </w:r>
     </w:p>
     <w:p>
@@ -19637,7 +19646,7 @@
           <w:color w:val="0D233A"/>
           <w:sz w:val="18"/>
         </w:rPr>
-        <w:t>Tabla: Matriz de Pruebas Estadísticas y Diagnóstico Econométrico</w:t>
+        <w:t>Tabla: Resumen de Pruebas Estadísticas y Diagnóstico Econométrico</w:t>
       </w:r>
     </w:p>
     <w:tbl>
@@ -19687,7 +19696,7 @@
                 <w:color w:val="0D233A"/>
                 <w:sz w:val="17"/>
               </w:rPr>
-              <w:t>Prueba Estadística</w:t>
+              <w:t>Prueba</w:t>
             </w:r>
           </w:p>
         </w:tc>
@@ -19771,7 +19780,7 @@
                 <w:color w:val="0D233A"/>
                 <w:sz w:val="17"/>
               </w:rPr>
-              <w:t>P-Valor / Criterio</w:t>
+              <w:t>P-Valor</w:t>
             </w:r>
           </w:p>
         </w:tc>
@@ -19799,7 +19808,7 @@
                 <w:color w:val="0D233A"/>
                 <w:sz w:val="17"/>
               </w:rPr>
-              <w:t>Conclusión Econométrica</w:t>
+              <w:t>Conclusión</w:t>
             </w:r>
           </w:p>
         </w:tc>
@@ -20327,7 +20336,7 @@
                 <w:color w:val="0F172A"/>
                 <w:sz w:val="17"/>
               </w:rPr>
-              <w:t>Ajuste óptimo con colas pesadas t-Student</w:t>
+              <w:t>Ajuste con colas pesadas t-Student</w:t>
             </w:r>
           </w:p>
         </w:tc>
@@ -20777,7 +20786,7 @@
                 <w:color w:val="0F172A"/>
                 <w:sz w:val="17"/>
               </w:rPr>
-              <w:t>Ruptura Estructural de Media</w:t>
+              <w:t>Estabilidad Paramétrica</w:t>
             </w:r>
           </w:p>
         </w:tc>
@@ -20881,7 +20890,7 @@
           <w:color w:val="0D233A"/>
           <w:sz w:val="26"/>
         </w:rPr>
-        <w:t>17. Dictamen Final y Recomendación de Inversión</w:t>
+        <w:t>17. Dictamen Final y Conclusión del Modelo</w:t>
       </w:r>
     </w:p>
     <w:p>
@@ -20894,7 +20903,7 @@
           <w:color w:val="0F172A"/>
           <w:sz w:val="19"/>
         </w:rPr>
-        <w:t>El dictamen cuantitativo del modelo es COMPRAR, fundamentado en:</w:t>
+        <w:t>El modelo de valuación concluye una recomendación de COMPRAR, fundamentada en:</w:t>
       </w:r>
     </w:p>
     <w:p>
@@ -20946,7 +20955,7 @@
           <w:color w:val="0F172A"/>
           <w:sz w:val="19"/>
         </w:rPr>
-        <w:t>• Margen de Seguridad Fundamental: El precio spot descuenta una tasa terminal implícita pesimista (g* = 0,69%), ofreciendo un margen de seguridad de ARS 253,50 por acción frente al valor intrínseco de régimen.</w:t>
+        <w:t>• Margen de Seguridad Fundamental: La cotización actual descuenta una tasa terminal implícita contractiva (g* = 0,69%), ofreciendo un margen de seguridad de ARS 253,50 por acción frente al valor fundamental de régimen.</w:t>
       </w:r>
     </w:p>
     <w:p>
@@ -20982,7 +20991,7 @@
           <w:color w:val="0F172A"/>
           <w:sz w:val="19"/>
         </w:rPr>
-        <w:t>Los estados financieros consolidados reproducen las cifras anuales auditadas por Price Waterhouse &amp; Co. S.R.L. convertidas al CCL implícito de cierre de cada ejercicio. El NOPAT proyectado aplica la alícuota estatutaria del 35% (Ley 20.628).</w:t>
+        <w:t>Cifras históricas anuales auditadas por Price Waterhouse &amp; Co. S.R.L. convertidas al CCL de cierre de cada ejercicio. Las proyecciones aplican la alícuota estatutaria del 35% sobre el resultado operativo (Ley 20.628).</w:t>
       </w:r>
     </w:p>
     <w:p>
@@ -20997,7 +21006,7 @@
           <w:color w:val="0D233A"/>
           <w:sz w:val="18"/>
         </w:rPr>
-        <w:t>Tabla: Cuadro de Reconciliación Impositiva FY2025</w:t>
+        <w:t>Tabla: Conciliación de la Tasa Efectiva del Impuesto a las Ganancias FY2025</w:t>
       </w:r>
     </w:p>
     <w:tbl>
@@ -21449,7 +21458,7 @@
                 <w:color w:val="0F172A"/>
                 <w:sz w:val="17"/>
               </w:rPr>
-              <w:t>Impuesto a las Ganancias Contabilizado</w:t>
+              <w:t>Impuesto a las Ganancias Devengado en Estados Contables</w:t>
             </w:r>
           </w:p>
         </w:tc>
@@ -21576,7 +21585,7 @@
                 <w:color w:val="0D233A"/>
                 <w:sz w:val="17"/>
               </w:rPr>
-              <w:t>Línea de Cuenta</w:t>
+              <w:t>Línea Contable</w:t>
             </w:r>
           </w:p>
         </w:tc>
@@ -27661,7 +27670,7 @@
                 <w:color w:val="0D233A"/>
                 <w:sz w:val="17"/>
               </w:rPr>
-              <w:t>Cuenta / Año Fiscal</w:t>
+              <w:t>Cuenta / Ejercicio</w:t>
             </w:r>
           </w:p>
         </w:tc>
@@ -29402,7 +29411,7 @@
           <w:color w:val="0F172A"/>
           <w:sz w:val="19"/>
         </w:rPr>
-        <w:t>Reconciliación FCFF Explícito 2030E vs. Terminal Normalizado: FCFF Explícito 2030E: USD 164,0 MM (incluye CAPEX de mantenimiento de USD 90,6 MM y ΔNWC = USD 23,9 MM). FCFF Terminal Normalizado (g = 2,0%): USD 135,5 MM (asume estado estacionario donde CAPEX = D&amp;A y ΔNWC = $0, convergiendo exactamente al NOPAT de 2030E según la metodología Dumrauf Cap. 14).</w:t>
+        <w:t>Reconciliación FCFF Explícito 2030E vs. Terminal Normalizado: FCFF Explícito 2030E: USD 164,0 MM (con CAPEX de mantenimiento de USD 90,6 MM y liberación de NWC de USD 23,9 MM). FCFF Terminal Normalizado (g = 2,0%): USD 135,5 MM (asume estado estacionario donde CAPEX = D&amp;A y ΔNWC = $0, coincidiendo con el NOPAT de 2030E según la formulación canónica de Dumrauf Cap. 14).</w:t>
       </w:r>
     </w:p>
     <w:p>
@@ -29420,7 +29429,7 @@
           <w:color w:val="0D233A"/>
           <w:sz w:val="26"/>
         </w:rPr>
-        <w:t>Referencias Bibliográficas y Fuentes Académicas</w:t>
+        <w:t>Referencias Bibliográficas y Fuentes de Información</w:t>
       </w:r>
     </w:p>
     <w:p>
@@ -29636,7 +29645,7 @@
                 <w:color w:val="0D233A"/>
                 <w:sz w:val="20"/>
               </w:rPr>
-              <w:t>Aviso Legal y Certificación del Analista (Research Standards / Ley 26.831)</w:t>
+              <w:t>Aviso Legal y Certificación del Analista (Ley 26.831)</w:t>
               <w:br/>
             </w:r>
             <w:r>
@@ -29645,7 +29654,7 @@
                 <w:color w:val="0F172A"/>
                 <w:sz w:val="18"/>
               </w:rPr>
-              <w:t>Este documento fue elaborado con fines exclusivamente de investigación académica, educativa y de análisis cuantitativo independiente por Federico Agustín Chillón (FCE, Universidad Nacional de Cuyo). El presente reporte no constituye una oferta pública, asesoramiento financiero personalizado, recomendación vinculante de compra o venta, ni intermediación bursátil en los términos de la Ley de Mercado de Capitales N.° 26.831 y las normas reglamentarias de la Comisión Nacional de Valores (CNV). El autor certifica que las opiniones técnicas, estimaciones financieras y modelizaciones cuantitativas reflejan un análisis independiente fundamentado rigurosamente en datos contables públicos auditados por Price Waterhouse &amp; Co. S.R.L., series de mercado de BYMA, CBOE, S&amp;P Dow Jones y el London Metal Exchange (LME). Cualquier decisión de inversión que un tercero adopte en base a este modelo es de su exclusiva responsabilidad y riesgo.</w:t>
+              <w:t>Este documento fue elaborado con fines exclusivamente de investigación académica y análisis financiero por Federico Agustín Chillón (FCE, Universidad Nacional de Cuyo). El presente reporte no constituye oferta pública, asesoramiento financiero personalizado, recomendación vinculante de compra o venta, ni intermediación bursátil en los términos de la Ley de Mercado de Capitales N.° 26.831 y normas concordantes de la Comisión Nacional de Valores (CNV). El autor certifica que las estimaciones y modelizaciones reflejan un análisis técnico independiente fundamentado en estados contables públicos auditados por Price Waterhouse &amp; Co. S.R.L., series de mercado de BYMA, CBOE, S&amp;P Dow Jones y el London Metal Exchange (LME). Cualquier decisión de inversión que un tercero adopte en base a este informe es de su exclusiva responsabilidad.</w:t>
               <w:br/>
             </w:r>
           </w:p>

</xml_diff>